<commit_message>
Switch font from Inter to Lato, regenerate all 4 showcase reports
Font change:
- Replace Inter with Lato in HEADING_FONT, BODY_FONT (docx_generator.py),
  matplotlib sans-serif stack (charts.py), config defaults (config.py),
  and all CLAUDE.md documentation references

Report regeneration:
- All 4 showcase reports (Thums Up, Weight Loss, Make in India,
  Mosquito Repellent) regenerated with Lato font and new temporal
  distribution chart + data collection period on cover page

Co-Authored-By: Claude Opus 4.6 (1M context) <noreply@anthropic.com>
</commit_message>
<xml_diff>
--- a/examples/outcomes/thums_up/thums_up_report.docx
+++ b/examples/outcomes/thums_up/thums_up_report.docx
@@ -9,7 +9,7 @@
       </w:pPr>
       <w:r>
         <w:rPr>
-          <w:rFonts w:ascii="Inter" w:hAnsi="Inter"/>
+          <w:rFonts w:ascii="Lato" w:hAnsi="Lato"/>
           <w:b/>
           <w:i w:val="0"/>
           <w:color w:val="0F2440"/>
@@ -25,7 +25,7 @@
       </w:pPr>
       <w:r>
         <w:rPr>
-          <w:rFonts w:ascii="Inter" w:hAnsi="Inter"/>
+          <w:rFonts w:ascii="Lato" w:hAnsi="Lato"/>
           <w:b w:val="0"/>
           <w:i w:val="0"/>
           <w:color w:val="374151"/>
@@ -41,7 +41,7 @@
       </w:pPr>
       <w:r>
         <w:rPr>
-          <w:rFonts w:ascii="Inter" w:hAnsi="Inter"/>
+          <w:rFonts w:ascii="Lato" w:hAnsi="Lato"/>
           <w:b w:val="0"/>
           <w:i w:val="0"/>
           <w:color w:val="6B7280"/>
@@ -65,7 +65,7 @@
       </w:pPr>
       <w:r>
         <w:rPr>
-          <w:rFonts w:ascii="Inter" w:hAnsi="Inter"/>
+          <w:rFonts w:ascii="Lato" w:hAnsi="Lato"/>
           <w:b/>
           <w:color w:val="1E3A5F"/>
           <w:sz w:val="32"/>
@@ -80,7 +80,7 @@
       </w:pPr>
       <w:r>
         <w:rPr>
-          <w:rFonts w:ascii="Inter" w:hAnsi="Inter"/>
+          <w:rFonts w:ascii="Lato" w:hAnsi="Lato"/>
           <w:b w:val="0"/>
           <w:i w:val="0"/>
           <w:sz w:val="22"/>
@@ -95,7 +95,7 @@
       </w:pPr>
       <w:r>
         <w:rPr>
-          <w:rFonts w:ascii="Inter" w:hAnsi="Inter"/>
+          <w:rFonts w:ascii="Lato" w:hAnsi="Lato"/>
           <w:b w:val="0"/>
           <w:i w:val="0"/>
           <w:sz w:val="22"/>
@@ -110,7 +110,7 @@
       </w:pPr>
       <w:r>
         <w:rPr>
-          <w:rFonts w:ascii="Inter" w:hAnsi="Inter"/>
+          <w:rFonts w:ascii="Lato" w:hAnsi="Lato"/>
           <w:b w:val="0"/>
           <w:i w:val="0"/>
           <w:sz w:val="22"/>
@@ -125,7 +125,7 @@
       </w:pPr>
       <w:r>
         <w:rPr>
-          <w:rFonts w:ascii="Inter" w:hAnsi="Inter"/>
+          <w:rFonts w:ascii="Lato" w:hAnsi="Lato"/>
           <w:b w:val="0"/>
           <w:i w:val="0"/>
           <w:sz w:val="22"/>
@@ -140,7 +140,7 @@
       </w:pPr>
       <w:r>
         <w:rPr>
-          <w:rFonts w:ascii="Inter" w:hAnsi="Inter"/>
+          <w:rFonts w:ascii="Lato" w:hAnsi="Lato"/>
           <w:b w:val="0"/>
           <w:i w:val="0"/>
           <w:sz w:val="22"/>
@@ -164,7 +164,7 @@
       </w:pPr>
       <w:r>
         <w:rPr>
-          <w:rFonts w:ascii="Inter" w:hAnsi="Inter"/>
+          <w:rFonts w:ascii="Lato" w:hAnsi="Lato"/>
           <w:b/>
           <w:color w:val="1E3A5F"/>
           <w:sz w:val="32"/>
@@ -195,7 +195,7 @@
             <w:r/>
             <w:r>
               <w:rPr>
-                <w:rFonts w:ascii="Inter" w:hAnsi="Inter"/>
+                <w:rFonts w:ascii="Lato" w:hAnsi="Lato"/>
                 <w:b w:val="0"/>
                 <w:i w:val="0"/>
                 <w:color w:val="374151"/>
@@ -216,7 +216,7 @@
             <w:r/>
             <w:r>
               <w:rPr>
-                <w:rFonts w:ascii="Inter" w:hAnsi="Inter"/>
+                <w:rFonts w:ascii="Lato" w:hAnsi="Lato"/>
                 <w:b/>
                 <w:i w:val="0"/>
                 <w:color w:val="1E3A5F"/>
@@ -239,7 +239,51 @@
             <w:r/>
             <w:r>
               <w:rPr>
-                <w:rFonts w:ascii="Inter" w:hAnsi="Inter"/>
+                <w:rFonts w:ascii="Lato" w:hAnsi="Lato"/>
+                <w:b w:val="0"/>
+                <w:i w:val="0"/>
+                <w:color w:val="374151"/>
+                <w:sz w:val="22"/>
+              </w:rPr>
+              <w:t>Data Collection Period</w:t>
+            </w:r>
+          </w:p>
+        </w:tc>
+        <w:tc>
+          <w:tcPr>
+            <w:tcW w:type="dxa" w:w="4703"/>
+          </w:tcPr>
+          <w:p>
+            <w:pPr>
+              <w:spacing w:before="80" w:after="80"/>
+            </w:pPr>
+            <w:r/>
+            <w:r>
+              <w:rPr>
+                <w:rFonts w:ascii="Lato" w:hAnsi="Lato"/>
+                <w:b/>
+                <w:i w:val="0"/>
+                <w:color w:val="1E3A5F"/>
+                <w:sz w:val="26"/>
+              </w:rPr>
+              <w:t>Jan 1952 - Mar 2026</w:t>
+            </w:r>
+          </w:p>
+        </w:tc>
+      </w:tr>
+      <w:tr>
+        <w:tc>
+          <w:tcPr>
+            <w:tcW w:type="dxa" w:w="4703"/>
+          </w:tcPr>
+          <w:p>
+            <w:pPr>
+              <w:spacing w:before="80" w:after="80"/>
+            </w:pPr>
+            <w:r/>
+            <w:r>
+              <w:rPr>
+                <w:rFonts w:ascii="Lato" w:hAnsi="Lato"/>
                 <w:b w:val="0"/>
                 <w:i w:val="0"/>
                 <w:color w:val="374151"/>
@@ -260,7 +304,7 @@
             <w:r/>
             <w:r>
               <w:rPr>
-                <w:rFonts w:ascii="Inter" w:hAnsi="Inter"/>
+                <w:rFonts w:ascii="Lato" w:hAnsi="Lato"/>
                 <w:b/>
                 <w:i w:val="0"/>
                 <w:color w:val="1E3A5F"/>
@@ -283,7 +327,7 @@
             <w:r/>
             <w:r>
               <w:rPr>
-                <w:rFonts w:ascii="Inter" w:hAnsi="Inter"/>
+                <w:rFonts w:ascii="Lato" w:hAnsi="Lato"/>
                 <w:b w:val="0"/>
                 <w:i w:val="0"/>
                 <w:color w:val="374151"/>
@@ -304,7 +348,7 @@
             <w:r/>
             <w:r>
               <w:rPr>
-                <w:rFonts w:ascii="Inter" w:hAnsi="Inter"/>
+                <w:rFonts w:ascii="Lato" w:hAnsi="Lato"/>
                 <w:b/>
                 <w:i w:val="0"/>
                 <w:color w:val="059669"/>
@@ -327,7 +371,7 @@
             <w:r/>
             <w:r>
               <w:rPr>
-                <w:rFonts w:ascii="Inter" w:hAnsi="Inter"/>
+                <w:rFonts w:ascii="Lato" w:hAnsi="Lato"/>
                 <w:b w:val="0"/>
                 <w:i w:val="0"/>
                 <w:color w:val="374151"/>
@@ -348,7 +392,7 @@
             <w:r/>
             <w:r>
               <w:rPr>
-                <w:rFonts w:ascii="Inter" w:hAnsi="Inter"/>
+                <w:rFonts w:ascii="Lato" w:hAnsi="Lato"/>
                 <w:b/>
                 <w:i w:val="0"/>
                 <w:color w:val="DC2626"/>
@@ -371,7 +415,7 @@
             <w:r/>
             <w:r>
               <w:rPr>
-                <w:rFonts w:ascii="Inter" w:hAnsi="Inter"/>
+                <w:rFonts w:ascii="Lato" w:hAnsi="Lato"/>
                 <w:b w:val="0"/>
                 <w:i w:val="0"/>
                 <w:color w:val="374151"/>
@@ -392,7 +436,7 @@
             <w:r/>
             <w:r>
               <w:rPr>
-                <w:rFonts w:ascii="Inter" w:hAnsi="Inter"/>
+                <w:rFonts w:ascii="Lato" w:hAnsi="Lato"/>
                 <w:b/>
                 <w:i w:val="0"/>
                 <w:color w:val="1E3A5F"/>
@@ -416,7 +460,7 @@
       </w:pPr>
       <w:r>
         <w:rPr>
-          <w:rFonts w:ascii="Inter" w:hAnsi="Inter"/>
+          <w:rFonts w:ascii="Lato" w:hAnsi="Lato"/>
           <w:b/>
           <w:color w:val="1E3A5F"/>
           <w:sz w:val="44"/>
@@ -431,7 +475,7 @@
       </w:pPr>
       <w:r>
         <w:rPr>
-          <w:rFonts w:ascii="Inter" w:hAnsi="Inter"/>
+          <w:rFonts w:ascii="Lato" w:hAnsi="Lato"/>
           <w:b/>
           <w:color w:val="1E3A5F"/>
           <w:sz w:val="32"/>
@@ -445,7 +489,7 @@
       </w:pPr>
       <w:r>
         <w:rPr>
-          <w:rFonts w:ascii="Inter" w:hAnsi="Inter"/>
+          <w:rFonts w:ascii="Lato" w:hAnsi="Lato"/>
           <w:b w:val="0"/>
           <w:i w:val="0"/>
           <w:sz w:val="22"/>
@@ -477,7 +521,7 @@
             <w:r/>
             <w:r>
               <w:rPr>
-                <w:rFonts w:ascii="Inter" w:hAnsi="Inter"/>
+                <w:rFonts w:ascii="Lato" w:hAnsi="Lato"/>
                 <w:b/>
                 <w:i w:val="0"/>
                 <w:color w:val="FFFFFF"/>
@@ -499,7 +543,7 @@
             <w:r/>
             <w:r>
               <w:rPr>
-                <w:rFonts w:ascii="Inter" w:hAnsi="Inter"/>
+                <w:rFonts w:ascii="Lato" w:hAnsi="Lato"/>
                 <w:b/>
                 <w:i w:val="0"/>
                 <w:color w:val="FFFFFF"/>
@@ -521,7 +565,7 @@
             <w:r/>
             <w:r>
               <w:rPr>
-                <w:rFonts w:ascii="Inter" w:hAnsi="Inter"/>
+                <w:rFonts w:ascii="Lato" w:hAnsi="Lato"/>
                 <w:b/>
                 <w:i w:val="0"/>
                 <w:color w:val="FFFFFF"/>
@@ -637,7 +681,7 @@
       </w:pPr>
       <w:r>
         <w:rPr>
-          <w:rFonts w:ascii="Inter" w:hAnsi="Inter"/>
+          <w:rFonts w:ascii="Lato" w:hAnsi="Lato"/>
           <w:b/>
           <w:color w:val="1E3A5F"/>
           <w:sz w:val="32"/>
@@ -669,7 +713,7 @@
             <w:r/>
             <w:r>
               <w:rPr>
-                <w:rFonts w:ascii="Inter" w:hAnsi="Inter"/>
+                <w:rFonts w:ascii="Lato" w:hAnsi="Lato"/>
                 <w:b/>
                 <w:i w:val="0"/>
                 <w:color w:val="FFFFFF"/>
@@ -691,7 +735,7 @@
             <w:r/>
             <w:r>
               <w:rPr>
-                <w:rFonts w:ascii="Inter" w:hAnsi="Inter"/>
+                <w:rFonts w:ascii="Lato" w:hAnsi="Lato"/>
                 <w:b/>
                 <w:i w:val="0"/>
                 <w:color w:val="FFFFFF"/>
@@ -713,7 +757,7 @@
             <w:r/>
             <w:r>
               <w:rPr>
-                <w:rFonts w:ascii="Inter" w:hAnsi="Inter"/>
+                <w:rFonts w:ascii="Lato" w:hAnsi="Lato"/>
                 <w:b/>
                 <w:i w:val="0"/>
                 <w:color w:val="FFFFFF"/>
@@ -860,7 +904,7 @@
       <w:r>
         <w:drawing>
           <wp:inline xmlns:a="http://schemas.openxmlformats.org/drawingml/2006/main" xmlns:pic="http://schemas.openxmlformats.org/drawingml/2006/picture">
-            <wp:extent cx="4114800" cy="1402891"/>
+            <wp:extent cx="4114800" cy="1408928"/>
             <wp:docPr id="1" name="Picture 1"/>
             <wp:cNvGraphicFramePr>
               <a:graphicFrameLocks noChangeAspect="1"/>
@@ -881,7 +925,7 @@
                   <pic:spPr>
                     <a:xfrm>
                       <a:off x="0" y="0"/>
-                      <a:ext cx="4114800" cy="1402891"/>
+                      <a:ext cx="4114800" cy="1408928"/>
                     </a:xfrm>
                     <a:prstGeom prst="rect"/>
                   </pic:spPr>
@@ -899,7 +943,7 @@
       </w:pPr>
       <w:r>
         <w:rPr>
-          <w:rFonts w:ascii="Inter" w:hAnsi="Inter"/>
+          <w:rFonts w:ascii="Lato" w:hAnsi="Lato"/>
           <w:b w:val="0"/>
           <w:i/>
           <w:color w:val="6B7280"/>
@@ -915,12 +959,12 @@
       </w:pPr>
       <w:r>
         <w:rPr>
-          <w:rFonts w:ascii="Inter" w:hAnsi="Inter"/>
+          <w:rFonts w:ascii="Lato" w:hAnsi="Lato"/>
           <w:b/>
           <w:color w:val="1E3A5F"/>
           <w:sz w:val="32"/>
         </w:rPr>
-        <w:t>Collection Methodology</w:t>
+        <w:t>Temporal Distribution</w:t>
       </w:r>
     </w:p>
     <w:p>
@@ -929,27 +973,111 @@
       </w:pPr>
       <w:r>
         <w:rPr>
-          <w:rFonts w:ascii="Inter" w:hAnsi="Inter"/>
+          <w:rFonts w:ascii="Lato" w:hAnsi="Lato"/>
           <w:b w:val="0"/>
           <w:i w:val="0"/>
           <w:sz w:val="22"/>
         </w:rPr>
-        <w:t>Data was collected using automated scrapers with engagement-weighted filtering applied per platform. Thread-level deduplication caps comments per thread to prevent over-indexing vocal threads. All items passed an LLM relevance classification step before analysis.</w:t>
+        <w:t>The chart below shows how the analysed data is distributed across years. This illustrates the recency and concentration of the evidence base.</w:t>
       </w:r>
     </w:p>
     <w:p>
-      <w:r>
-        <w:br w:type="page"/>
+      <w:pPr>
+        <w:jc w:val="center"/>
+      </w:pPr>
+      <w:r>
+        <w:drawing>
+          <wp:inline xmlns:a="http://schemas.openxmlformats.org/drawingml/2006/main" xmlns:pic="http://schemas.openxmlformats.org/drawingml/2006/picture">
+            <wp:extent cx="4572000" cy="1969343"/>
+            <wp:docPr id="2" name="Picture 2"/>
+            <wp:cNvGraphicFramePr>
+              <a:graphicFrameLocks noChangeAspect="1"/>
+            </wp:cNvGraphicFramePr>
+            <a:graphic>
+              <a:graphicData uri="http://schemas.openxmlformats.org/drawingml/2006/picture">
+                <pic:pic>
+                  <pic:nvPicPr>
+                    <pic:cNvPr id="0" name="chart_temporal.png"/>
+                    <pic:cNvPicPr/>
+                  </pic:nvPicPr>
+                  <pic:blipFill>
+                    <a:blip r:embed="rId10"/>
+                    <a:stretch>
+                      <a:fillRect/>
+                    </a:stretch>
+                  </pic:blipFill>
+                  <pic:spPr>
+                    <a:xfrm>
+                      <a:off x="0" y="0"/>
+                      <a:ext cx="4572000" cy="1969343"/>
+                    </a:xfrm>
+                    <a:prstGeom prst="rect"/>
+                  </pic:spPr>
+                </pic:pic>
+              </a:graphicData>
+            </a:graphic>
+          </wp:inline>
+        </w:drawing>
       </w:r>
     </w:p>
     <w:p>
       <w:pPr>
+        <w:spacing w:after="240"/>
+        <w:jc w:val="center"/>
+      </w:pPr>
+      <w:r>
+        <w:rPr>
+          <w:rFonts w:ascii="Lato" w:hAnsi="Lato"/>
+          <w:b w:val="0"/>
+          <w:i/>
+          <w:color w:val="6B7280"/>
+          <w:sz w:val="18"/>
+        </w:rPr>
+        <w:t>Figure 2: Data distribution by year</w:t>
+      </w:r>
+    </w:p>
+    <w:p>
+      <w:pPr>
+        <w:pStyle w:val="Heading2"/>
+        <w:jc w:val="left"/>
+      </w:pPr>
+      <w:r>
+        <w:rPr>
+          <w:rFonts w:ascii="Lato" w:hAnsi="Lato"/>
+          <w:b/>
+          <w:color w:val="1E3A5F"/>
+          <w:sz w:val="32"/>
+        </w:rPr>
+        <w:t>Collection Methodology</w:t>
+      </w:r>
+    </w:p>
+    <w:p>
+      <w:pPr>
+        <w:spacing w:after="120" w:before="0"/>
+      </w:pPr>
+      <w:r>
+        <w:rPr>
+          <w:rFonts w:ascii="Lato" w:hAnsi="Lato"/>
+          <w:b w:val="0"/>
+          <w:i w:val="0"/>
+          <w:sz w:val="22"/>
+        </w:rPr>
+        <w:t>Data was collected using automated scrapers with engagement-weighted filtering applied per platform. Thread-level deduplication caps comments per thread to prevent over-indexing vocal threads. All items passed an LLM relevance classification step before analysis.</w:t>
+      </w:r>
+    </w:p>
+    <w:p>
+      <w:r>
+        <w:br w:type="page"/>
+      </w:r>
+    </w:p>
+    <w:p>
+      <w:pPr>
         <w:pStyle w:val="Heading1"/>
         <w:jc w:val="left"/>
       </w:pPr>
       <w:r>
         <w:rPr>
-          <w:rFonts w:ascii="Inter" w:hAnsi="Inter"/>
+          <w:rFonts w:ascii="Lato" w:hAnsi="Lato"/>
           <w:b/>
           <w:color w:val="1E3A5F"/>
           <w:sz w:val="44"/>
@@ -964,7 +1092,7 @@
       </w:pPr>
       <w:r>
         <w:rPr>
-          <w:rFonts w:ascii="Inter" w:hAnsi="Inter"/>
+          <w:rFonts w:ascii="Lato" w:hAnsi="Lato"/>
           <w:b/>
           <w:color w:val="1E3A5F"/>
           <w:sz w:val="32"/>
@@ -978,7 +1106,7 @@
       </w:pPr>
       <w:r>
         <w:rPr>
-          <w:rFonts w:ascii="Inter" w:hAnsi="Inter"/>
+          <w:rFonts w:ascii="Lato" w:hAnsi="Lato"/>
           <w:b w:val="0"/>
           <w:i w:val="0"/>
           <w:sz w:val="22"/>
@@ -992,7 +1120,7 @@
       </w:pPr>
       <w:r>
         <w:rPr>
-          <w:rFonts w:ascii="Inter" w:hAnsi="Inter"/>
+          <w:rFonts w:ascii="Lato" w:hAnsi="Lato"/>
           <w:b w:val="0"/>
           <w:i/>
           <w:color w:val="6B7280"/>
@@ -1008,8 +1136,8 @@
       <w:r>
         <w:drawing>
           <wp:inline xmlns:a="http://schemas.openxmlformats.org/drawingml/2006/main" xmlns:pic="http://schemas.openxmlformats.org/drawingml/2006/picture">
-            <wp:extent cx="4572000" cy="1673601"/>
-            <wp:docPr id="2" name="Picture 2"/>
+            <wp:extent cx="4572000" cy="1681223"/>
+            <wp:docPr id="3" name="Picture 3"/>
             <wp:cNvGraphicFramePr>
               <a:graphicFrameLocks noChangeAspect="1"/>
             </wp:cNvGraphicFramePr>
@@ -1021,7 +1149,7 @@
                     <pic:cNvPicPr/>
                   </pic:nvPicPr>
                   <pic:blipFill>
-                    <a:blip r:embed="rId10"/>
+                    <a:blip r:embed="rId11"/>
                     <a:stretch>
                       <a:fillRect/>
                     </a:stretch>
@@ -1029,7 +1157,7 @@
                   <pic:spPr>
                     <a:xfrm>
                       <a:off x="0" y="0"/>
-                      <a:ext cx="4572000" cy="1673601"/>
+                      <a:ext cx="4572000" cy="1681223"/>
                     </a:xfrm>
                     <a:prstGeom prst="rect"/>
                   </pic:spPr>
@@ -1047,7 +1175,7 @@
       </w:pPr>
       <w:r>
         <w:rPr>
-          <w:rFonts w:ascii="Inter" w:hAnsi="Inter"/>
+          <w:rFonts w:ascii="Lato" w:hAnsi="Lato"/>
           <w:b w:val="0"/>
           <w:i/>
           <w:color w:val="6B7280"/>
@@ -1063,7 +1191,7 @@
       </w:pPr>
       <w:r>
         <w:rPr>
-          <w:rFonts w:ascii="Inter" w:hAnsi="Inter"/>
+          <w:rFonts w:ascii="Lato" w:hAnsi="Lato"/>
           <w:b/>
           <w:color w:val="1E3A5F"/>
           <w:sz w:val="32"/>
@@ -1094,7 +1222,7 @@
             <w:r/>
             <w:r>
               <w:rPr>
-                <w:rFonts w:ascii="Inter" w:hAnsi="Inter"/>
+                <w:rFonts w:ascii="Lato" w:hAnsi="Lato"/>
                 <w:b/>
                 <w:i w:val="0"/>
                 <w:color w:val="FFFFFF"/>
@@ -1116,7 +1244,7 @@
             <w:r/>
             <w:r>
               <w:rPr>
-                <w:rFonts w:ascii="Inter" w:hAnsi="Inter"/>
+                <w:rFonts w:ascii="Lato" w:hAnsi="Lato"/>
                 <w:b/>
                 <w:i w:val="0"/>
                 <w:color w:val="FFFFFF"/>
@@ -1333,8 +1461,8 @@
       <w:r>
         <w:drawing>
           <wp:inline xmlns:a="http://schemas.openxmlformats.org/drawingml/2006/main" xmlns:pic="http://schemas.openxmlformats.org/drawingml/2006/picture">
-            <wp:extent cx="4572000" cy="2254129"/>
-            <wp:docPr id="3" name="Picture 3"/>
+            <wp:extent cx="4572000" cy="2258493"/>
+            <wp:docPr id="4" name="Picture 4"/>
             <wp:cNvGraphicFramePr>
               <a:graphicFrameLocks noChangeAspect="1"/>
             </wp:cNvGraphicFramePr>
@@ -1346,7 +1474,7 @@
                     <pic:cNvPicPr/>
                   </pic:nvPicPr>
                   <pic:blipFill>
-                    <a:blip r:embed="rId11"/>
+                    <a:blip r:embed="rId12"/>
                     <a:stretch>
                       <a:fillRect/>
                     </a:stretch>
@@ -1354,7 +1482,7 @@
                   <pic:spPr>
                     <a:xfrm>
                       <a:off x="0" y="0"/>
-                      <a:ext cx="4572000" cy="2254129"/>
+                      <a:ext cx="4572000" cy="2258493"/>
                     </a:xfrm>
                     <a:prstGeom prst="rect"/>
                   </pic:spPr>
@@ -1372,7 +1500,7 @@
       </w:pPr>
       <w:r>
         <w:rPr>
-          <w:rFonts w:ascii="Inter" w:hAnsi="Inter"/>
+          <w:rFonts w:ascii="Lato" w:hAnsi="Lato"/>
           <w:b w:val="0"/>
           <w:i/>
           <w:color w:val="6B7280"/>
@@ -1388,7 +1516,7 @@
       </w:pPr>
       <w:r>
         <w:rPr>
-          <w:rFonts w:ascii="Inter" w:hAnsi="Inter"/>
+          <w:rFonts w:ascii="Lato" w:hAnsi="Lato"/>
           <w:b/>
           <w:color w:val="1E3A5F"/>
           <w:sz w:val="32"/>
@@ -1402,7 +1530,7 @@
       </w:pPr>
       <w:r>
         <w:rPr>
-          <w:rFonts w:ascii="Inter" w:hAnsi="Inter"/>
+          <w:rFonts w:ascii="Lato" w:hAnsi="Lato"/>
           <w:b w:val="0"/>
           <w:i w:val="0"/>
           <w:sz w:val="22"/>
@@ -1436,7 +1564,7 @@
             <w:r/>
             <w:r>
               <w:rPr>
-                <w:rFonts w:ascii="Inter" w:hAnsi="Inter"/>
+                <w:rFonts w:ascii="Lato" w:hAnsi="Lato"/>
                 <w:b/>
                 <w:i w:val="0"/>
                 <w:color w:val="FFFFFF"/>
@@ -1458,7 +1586,7 @@
             <w:r/>
             <w:r>
               <w:rPr>
-                <w:rFonts w:ascii="Inter" w:hAnsi="Inter"/>
+                <w:rFonts w:ascii="Lato" w:hAnsi="Lato"/>
                 <w:b/>
                 <w:i w:val="0"/>
                 <w:color w:val="FFFFFF"/>
@@ -1480,7 +1608,7 @@
             <w:r/>
             <w:r>
               <w:rPr>
-                <w:rFonts w:ascii="Inter" w:hAnsi="Inter"/>
+                <w:rFonts w:ascii="Lato" w:hAnsi="Lato"/>
                 <w:b/>
                 <w:i w:val="0"/>
                 <w:color w:val="FFFFFF"/>
@@ -1502,7 +1630,7 @@
             <w:r/>
             <w:r>
               <w:rPr>
-                <w:rFonts w:ascii="Inter" w:hAnsi="Inter"/>
+                <w:rFonts w:ascii="Lato" w:hAnsi="Lato"/>
                 <w:b/>
                 <w:i w:val="0"/>
                 <w:color w:val="FFFFFF"/>
@@ -1524,7 +1652,7 @@
             <w:r/>
             <w:r>
               <w:rPr>
-                <w:rFonts w:ascii="Inter" w:hAnsi="Inter"/>
+                <w:rFonts w:ascii="Lato" w:hAnsi="Lato"/>
                 <w:b/>
                 <w:i w:val="0"/>
                 <w:color w:val="FFFFFF"/>
@@ -1958,7 +2086,7 @@
       </w:pPr>
       <w:r>
         <w:rPr>
-          <w:rFonts w:ascii="Inter" w:hAnsi="Inter"/>
+          <w:rFonts w:ascii="Lato" w:hAnsi="Lato"/>
           <w:b w:val="0"/>
           <w:i w:val="0"/>
           <w:sz w:val="22"/>
@@ -1972,8 +2100,8 @@
       <w:r>
         <w:drawing>
           <wp:inline xmlns:a="http://schemas.openxmlformats.org/drawingml/2006/main" xmlns:pic="http://schemas.openxmlformats.org/drawingml/2006/picture">
-            <wp:extent cx="5029200" cy="2651217"/>
-            <wp:docPr id="4" name="Picture 4"/>
+            <wp:extent cx="5029200" cy="2640437"/>
+            <wp:docPr id="5" name="Picture 5"/>
             <wp:cNvGraphicFramePr>
               <a:graphicFrameLocks noChangeAspect="1"/>
             </wp:cNvGraphicFramePr>
@@ -1985,7 +2113,7 @@
                     <pic:cNvPicPr/>
                   </pic:nvPicPr>
                   <pic:blipFill>
-                    <a:blip r:embed="rId12"/>
+                    <a:blip r:embed="rId13"/>
                     <a:stretch>
                       <a:fillRect/>
                     </a:stretch>
@@ -1993,7 +2121,7 @@
                   <pic:spPr>
                     <a:xfrm>
                       <a:off x="0" y="0"/>
-                      <a:ext cx="5029200" cy="2651217"/>
+                      <a:ext cx="5029200" cy="2640437"/>
                     </a:xfrm>
                     <a:prstGeom prst="rect"/>
                   </pic:spPr>
@@ -2011,7 +2139,7 @@
       </w:pPr>
       <w:r>
         <w:rPr>
-          <w:rFonts w:ascii="Inter" w:hAnsi="Inter"/>
+          <w:rFonts w:ascii="Lato" w:hAnsi="Lato"/>
           <w:b w:val="0"/>
           <w:i/>
           <w:color w:val="6B7280"/>
@@ -2032,7 +2160,7 @@
       </w:pPr>
       <w:r>
         <w:rPr>
-          <w:rFonts w:ascii="Inter" w:hAnsi="Inter"/>
+          <w:rFonts w:ascii="Lato" w:hAnsi="Lato"/>
           <w:b/>
           <w:color w:val="1E3A5F"/>
           <w:sz w:val="44"/>
@@ -2046,7 +2174,7 @@
       </w:pPr>
       <w:r>
         <w:rPr>
-          <w:rFonts w:ascii="Inter" w:hAnsi="Inter"/>
+          <w:rFonts w:ascii="Lato" w:hAnsi="Lato"/>
           <w:b w:val="0"/>
           <w:i w:val="0"/>
           <w:sz w:val="22"/>
@@ -2081,7 +2209,7 @@
             <w:r/>
             <w:r>
               <w:rPr>
-                <w:rFonts w:ascii="Inter" w:hAnsi="Inter"/>
+                <w:rFonts w:ascii="Lato" w:hAnsi="Lato"/>
                 <w:b/>
                 <w:i w:val="0"/>
                 <w:color w:val="FFFFFF"/>
@@ -2103,7 +2231,7 @@
             <w:r/>
             <w:r>
               <w:rPr>
-                <w:rFonts w:ascii="Inter" w:hAnsi="Inter"/>
+                <w:rFonts w:ascii="Lato" w:hAnsi="Lato"/>
                 <w:b/>
                 <w:i w:val="0"/>
                 <w:color w:val="FFFFFF"/>
@@ -2125,7 +2253,7 @@
             <w:r/>
             <w:r>
               <w:rPr>
-                <w:rFonts w:ascii="Inter" w:hAnsi="Inter"/>
+                <w:rFonts w:ascii="Lato" w:hAnsi="Lato"/>
                 <w:b/>
                 <w:i w:val="0"/>
                 <w:color w:val="FFFFFF"/>
@@ -2147,7 +2275,7 @@
             <w:r/>
             <w:r>
               <w:rPr>
-                <w:rFonts w:ascii="Inter" w:hAnsi="Inter"/>
+                <w:rFonts w:ascii="Lato" w:hAnsi="Lato"/>
                 <w:b/>
                 <w:i w:val="0"/>
                 <w:color w:val="FFFFFF"/>
@@ -2169,7 +2297,7 @@
             <w:r/>
             <w:r>
               <w:rPr>
-                <w:rFonts w:ascii="Inter" w:hAnsi="Inter"/>
+                <w:rFonts w:ascii="Lato" w:hAnsi="Lato"/>
                 <w:b/>
                 <w:i w:val="0"/>
                 <w:color w:val="FFFFFF"/>
@@ -2191,7 +2319,7 @@
             <w:r/>
             <w:r>
               <w:rPr>
-                <w:rFonts w:ascii="Inter" w:hAnsi="Inter"/>
+                <w:rFonts w:ascii="Lato" w:hAnsi="Lato"/>
                 <w:b/>
                 <w:i w:val="0"/>
                 <w:color w:val="FFFFFF"/>
@@ -2954,8 +3082,8 @@
       <w:r>
         <w:drawing>
           <wp:inline xmlns:a="http://schemas.openxmlformats.org/drawingml/2006/main" xmlns:pic="http://schemas.openxmlformats.org/drawingml/2006/picture">
-            <wp:extent cx="5029200" cy="3750374"/>
-            <wp:docPr id="5" name="Picture 5"/>
+            <wp:extent cx="5029200" cy="3764734"/>
+            <wp:docPr id="6" name="Picture 6"/>
             <wp:cNvGraphicFramePr>
               <a:graphicFrameLocks noChangeAspect="1"/>
             </wp:cNvGraphicFramePr>
@@ -2967,7 +3095,7 @@
                     <pic:cNvPicPr/>
                   </pic:nvPicPr>
                   <pic:blipFill>
-                    <a:blip r:embed="rId13"/>
+                    <a:blip r:embed="rId14"/>
                     <a:stretch>
                       <a:fillRect/>
                     </a:stretch>
@@ -2975,7 +3103,7 @@
                   <pic:spPr>
                     <a:xfrm>
                       <a:off x="0" y="0"/>
-                      <a:ext cx="5029200" cy="3750374"/>
+                      <a:ext cx="5029200" cy="3764734"/>
                     </a:xfrm>
                     <a:prstGeom prst="rect"/>
                   </pic:spPr>
@@ -2993,7 +3121,7 @@
       </w:pPr>
       <w:r>
         <w:rPr>
-          <w:rFonts w:ascii="Inter" w:hAnsi="Inter"/>
+          <w:rFonts w:ascii="Lato" w:hAnsi="Lato"/>
           <w:b w:val="0"/>
           <w:i/>
           <w:color w:val="6B7280"/>
@@ -3014,7 +3142,7 @@
       </w:pPr>
       <w:r>
         <w:rPr>
-          <w:rFonts w:ascii="Inter" w:hAnsi="Inter"/>
+          <w:rFonts w:ascii="Lato" w:hAnsi="Lato"/>
           <w:b/>
           <w:color w:val="1E3A5F"/>
           <w:sz w:val="44"/>
@@ -3028,7 +3156,7 @@
       </w:pPr>
       <w:r>
         <w:rPr>
-          <w:rFonts w:ascii="Inter" w:hAnsi="Inter"/>
+          <w:rFonts w:ascii="Lato" w:hAnsi="Lato"/>
           <w:b w:val="0"/>
           <w:i w:val="0"/>
           <w:sz w:val="22"/>
@@ -3043,7 +3171,7 @@
       </w:pPr>
       <w:r>
         <w:rPr>
-          <w:rFonts w:ascii="Inter" w:hAnsi="Inter"/>
+          <w:rFonts w:ascii="Lato" w:hAnsi="Lato"/>
           <w:b/>
           <w:color w:val="1E3A5F"/>
           <w:sz w:val="32"/>
@@ -3057,7 +3185,7 @@
       </w:pPr>
       <w:r>
         <w:rPr>
-          <w:rFonts w:ascii="Inter" w:hAnsi="Inter"/>
+          <w:rFonts w:ascii="Lato" w:hAnsi="Lato"/>
           <w:b w:val="0"/>
           <w:i w:val="0"/>
           <w:color w:val="6B7280"/>
@@ -3067,7 +3195,7 @@
       </w:r>
       <w:r>
         <w:rPr>
-          <w:rFonts w:ascii="Inter" w:hAnsi="Inter"/>
+          <w:rFonts w:ascii="Lato" w:hAnsi="Lato"/>
           <w:b w:val="0"/>
           <w:i w:val="0"/>
           <w:color w:val="374151"/>
@@ -3077,7 +3205,7 @@
       </w:r>
       <w:r>
         <w:rPr>
-          <w:rFonts w:ascii="Inter" w:hAnsi="Inter"/>
+          <w:rFonts w:ascii="Lato" w:hAnsi="Lato"/>
           <w:b/>
           <w:i w:val="0"/>
           <w:color w:val="059669"/>
@@ -3087,7 +3215,7 @@
       </w:r>
       <w:r>
         <w:rPr>
-          <w:rFonts w:ascii="Inter" w:hAnsi="Inter"/>
+          <w:rFonts w:ascii="Lato" w:hAnsi="Lato"/>
           <w:b w:val="0"/>
           <w:i w:val="0"/>
           <w:color w:val="374151"/>
@@ -3097,7 +3225,7 @@
       </w:r>
       <w:r>
         <w:rPr>
-          <w:rFonts w:ascii="Inter" w:hAnsi="Inter"/>
+          <w:rFonts w:ascii="Lato" w:hAnsi="Lato"/>
           <w:b/>
           <w:i w:val="0"/>
           <w:color w:val="374151"/>
@@ -3107,7 +3235,7 @@
       </w:r>
       <w:r>
         <w:rPr>
-          <w:rFonts w:ascii="Inter" w:hAnsi="Inter"/>
+          <w:rFonts w:ascii="Lato" w:hAnsi="Lato"/>
           <w:b w:val="0"/>
           <w:i w:val="0"/>
           <w:color w:val="6B7280"/>
@@ -3117,7 +3245,7 @@
       </w:r>
       <w:r>
         <w:rPr>
-          <w:rFonts w:ascii="Inter" w:hAnsi="Inter"/>
+          <w:rFonts w:ascii="Lato" w:hAnsi="Lato"/>
           <w:b w:val="0"/>
           <w:i w:val="0"/>
           <w:color w:val="6B7280"/>
@@ -3127,7 +3255,7 @@
       </w:r>
       <w:r>
         <w:rPr>
-          <w:rFonts w:ascii="Inter" w:hAnsi="Inter"/>
+          <w:rFonts w:ascii="Lato" w:hAnsi="Lato"/>
           <w:b/>
           <w:i w:val="0"/>
           <w:color w:val="059669"/>
@@ -3143,8 +3271,8 @@
       <w:r>
         <w:drawing>
           <wp:inline xmlns:a="http://schemas.openxmlformats.org/drawingml/2006/main" xmlns:pic="http://schemas.openxmlformats.org/drawingml/2006/picture">
-            <wp:extent cx="3474720" cy="3525078"/>
-            <wp:docPr id="6" name="Picture 6"/>
+            <wp:extent cx="3474720" cy="3547185"/>
+            <wp:docPr id="7" name="Picture 7"/>
             <wp:cNvGraphicFramePr>
               <a:graphicFrameLocks noChangeAspect="1"/>
             </wp:cNvGraphicFramePr>
@@ -3156,7 +3284,7 @@
                     <pic:cNvPicPr/>
                   </pic:nvPicPr>
                   <pic:blipFill>
-                    <a:blip r:embed="rId14"/>
+                    <a:blip r:embed="rId15"/>
                     <a:stretch>
                       <a:fillRect/>
                     </a:stretch>
@@ -3164,7 +3292,7 @@
                   <pic:spPr>
                     <a:xfrm>
                       <a:off x="0" y="0"/>
-                      <a:ext cx="3474720" cy="3525078"/>
+                      <a:ext cx="3474720" cy="3547185"/>
                     </a:xfrm>
                     <a:prstGeom prst="rect"/>
                   </pic:spPr>
@@ -3182,7 +3310,7 @@
       </w:pPr>
       <w:r>
         <w:rPr>
-          <w:rFonts w:ascii="Inter" w:hAnsi="Inter"/>
+          <w:rFonts w:ascii="Lato" w:hAnsi="Lato"/>
           <w:b w:val="0"/>
           <w:i/>
           <w:color w:val="6B7280"/>
@@ -3198,7 +3326,7 @@
       </w:pPr>
       <w:r>
         <w:rPr>
-          <w:rFonts w:ascii="Inter" w:hAnsi="Inter"/>
+          <w:rFonts w:ascii="Lato" w:hAnsi="Lato"/>
           <w:b/>
           <w:color w:val="1E3A5F"/>
           <w:sz w:val="26"/>
@@ -3212,7 +3340,7 @@
       </w:pPr>
       <w:r>
         <w:rPr>
-          <w:rFonts w:ascii="Inter" w:hAnsi="Inter"/>
+          <w:rFonts w:ascii="Lato" w:hAnsi="Lato"/>
           <w:b w:val="0"/>
           <w:i w:val="0"/>
           <w:sz w:val="22"/>
@@ -3227,7 +3355,7 @@
       </w:pPr>
       <w:r>
         <w:rPr>
-          <w:rFonts w:ascii="Inter" w:hAnsi="Inter"/>
+          <w:rFonts w:ascii="Lato" w:hAnsi="Lato"/>
           <w:b/>
           <w:color w:val="1E3A5F"/>
           <w:sz w:val="26"/>
@@ -3241,7 +3369,7 @@
       </w:pPr>
       <w:r>
         <w:rPr>
-          <w:rFonts w:ascii="Inter" w:hAnsi="Inter"/>
+          <w:rFonts w:ascii="Lato" w:hAnsi="Lato"/>
           <w:b w:val="0"/>
           <w:i w:val="0"/>
           <w:sz w:val="22"/>
@@ -3256,7 +3384,7 @@
       </w:pPr>
       <w:r>
         <w:rPr>
-          <w:rFonts w:ascii="Inter" w:hAnsi="Inter"/>
+          <w:rFonts w:ascii="Lato" w:hAnsi="Lato"/>
           <w:b/>
           <w:color w:val="1E3A5F"/>
           <w:sz w:val="26"/>
@@ -3270,7 +3398,7 @@
       </w:pPr>
       <w:r>
         <w:rPr>
-          <w:rFonts w:ascii="Inter" w:hAnsi="Inter"/>
+          <w:rFonts w:ascii="Lato" w:hAnsi="Lato"/>
           <w:b w:val="0"/>
           <w:i w:val="0"/>
           <w:sz w:val="22"/>
@@ -3285,7 +3413,7 @@
       </w:pPr>
       <w:r>
         <w:rPr>
-          <w:rFonts w:ascii="Inter" w:hAnsi="Inter"/>
+          <w:rFonts w:ascii="Lato" w:hAnsi="Lato"/>
           <w:b/>
           <w:color w:val="1E3A5F"/>
           <w:sz w:val="26"/>
@@ -3299,7 +3427,7 @@
       </w:pPr>
       <w:r>
         <w:rPr>
-          <w:rFonts w:ascii="Inter" w:hAnsi="Inter"/>
+          <w:rFonts w:ascii="Lato" w:hAnsi="Lato"/>
           <w:b w:val="0"/>
           <w:i w:val="0"/>
           <w:sz w:val="22"/>
@@ -3314,7 +3442,7 @@
       </w:pPr>
       <w:r>
         <w:rPr>
-          <w:rFonts w:ascii="Inter" w:hAnsi="Inter"/>
+          <w:rFonts w:ascii="Lato" w:hAnsi="Lato"/>
           <w:b/>
           <w:color w:val="1E3A5F"/>
           <w:sz w:val="26"/>
@@ -3328,7 +3456,7 @@
       </w:pPr>
       <w:r>
         <w:rPr>
-          <w:rFonts w:ascii="Inter" w:hAnsi="Inter"/>
+          <w:rFonts w:ascii="Lato" w:hAnsi="Lato"/>
           <w:b w:val="0"/>
           <w:i w:val="0"/>
           <w:sz w:val="22"/>
@@ -3343,7 +3471,7 @@
       </w:pPr>
       <w:r>
         <w:rPr>
-          <w:rFonts w:ascii="Inter" w:hAnsi="Inter"/>
+          <w:rFonts w:ascii="Lato" w:hAnsi="Lato"/>
           <w:b/>
           <w:color w:val="1E3A5F"/>
           <w:sz w:val="26"/>
@@ -3358,7 +3486,7 @@
       </w:pPr>
       <w:r>
         <w:rPr>
-          <w:rFonts w:ascii="Inter" w:hAnsi="Inter"/>
+          <w:rFonts w:ascii="Lato" w:hAnsi="Lato"/>
           <w:b w:val="0"/>
           <w:i/>
           <w:color w:val="374151"/>
@@ -3368,7 +3496,7 @@
       </w:r>
       <w:r>
         <w:rPr>
-          <w:rFonts w:ascii="Inter" w:hAnsi="Inter"/>
+          <w:rFonts w:ascii="Lato" w:hAnsi="Lato"/>
           <w:b w:val="0"/>
           <w:i w:val="0"/>
           <w:color w:val="6B7280"/>
@@ -3384,7 +3512,7 @@
       </w:pPr>
       <w:r>
         <w:rPr>
-          <w:rFonts w:ascii="Inter" w:hAnsi="Inter"/>
+          <w:rFonts w:ascii="Lato" w:hAnsi="Lato"/>
           <w:b w:val="0"/>
           <w:i/>
           <w:color w:val="374151"/>
@@ -3394,7 +3522,7 @@
       </w:r>
       <w:r>
         <w:rPr>
-          <w:rFonts w:ascii="Inter" w:hAnsi="Inter"/>
+          <w:rFonts w:ascii="Lato" w:hAnsi="Lato"/>
           <w:b w:val="0"/>
           <w:i w:val="0"/>
           <w:color w:val="6B7280"/>
@@ -3410,7 +3538,7 @@
       </w:pPr>
       <w:r>
         <w:rPr>
-          <w:rFonts w:ascii="Inter" w:hAnsi="Inter"/>
+          <w:rFonts w:ascii="Lato" w:hAnsi="Lato"/>
           <w:b w:val="0"/>
           <w:i/>
           <w:color w:val="374151"/>
@@ -3422,7 +3550,7 @@
       </w:r>
       <w:r>
         <w:rPr>
-          <w:rFonts w:ascii="Inter" w:hAnsi="Inter"/>
+          <w:rFonts w:ascii="Lato" w:hAnsi="Lato"/>
           <w:b w:val="0"/>
           <w:i w:val="0"/>
           <w:color w:val="6B7280"/>
@@ -3446,7 +3574,7 @@
       </w:pPr>
       <w:r>
         <w:rPr>
-          <w:rFonts w:ascii="Inter" w:hAnsi="Inter"/>
+          <w:rFonts w:ascii="Lato" w:hAnsi="Lato"/>
           <w:b/>
           <w:color w:val="1E3A5F"/>
           <w:sz w:val="32"/>
@@ -3460,7 +3588,7 @@
       </w:pPr>
       <w:r>
         <w:rPr>
-          <w:rFonts w:ascii="Inter" w:hAnsi="Inter"/>
+          <w:rFonts w:ascii="Lato" w:hAnsi="Lato"/>
           <w:b w:val="0"/>
           <w:i w:val="0"/>
           <w:color w:val="6B7280"/>
@@ -3470,7 +3598,7 @@
       </w:r>
       <w:r>
         <w:rPr>
-          <w:rFonts w:ascii="Inter" w:hAnsi="Inter"/>
+          <w:rFonts w:ascii="Lato" w:hAnsi="Lato"/>
           <w:b w:val="0"/>
           <w:i w:val="0"/>
           <w:color w:val="374151"/>
@@ -3480,7 +3608,7 @@
       </w:r>
       <w:r>
         <w:rPr>
-          <w:rFonts w:ascii="Inter" w:hAnsi="Inter"/>
+          <w:rFonts w:ascii="Lato" w:hAnsi="Lato"/>
           <w:b/>
           <w:i w:val="0"/>
           <w:color w:val="059669"/>
@@ -3490,7 +3618,7 @@
       </w:r>
       <w:r>
         <w:rPr>
-          <w:rFonts w:ascii="Inter" w:hAnsi="Inter"/>
+          <w:rFonts w:ascii="Lato" w:hAnsi="Lato"/>
           <w:b w:val="0"/>
           <w:i w:val="0"/>
           <w:color w:val="374151"/>
@@ -3500,7 +3628,7 @@
       </w:r>
       <w:r>
         <w:rPr>
-          <w:rFonts w:ascii="Inter" w:hAnsi="Inter"/>
+          <w:rFonts w:ascii="Lato" w:hAnsi="Lato"/>
           <w:b/>
           <w:i w:val="0"/>
           <w:color w:val="374151"/>
@@ -3510,7 +3638,7 @@
       </w:r>
       <w:r>
         <w:rPr>
-          <w:rFonts w:ascii="Inter" w:hAnsi="Inter"/>
+          <w:rFonts w:ascii="Lato" w:hAnsi="Lato"/>
           <w:b w:val="0"/>
           <w:i w:val="0"/>
           <w:color w:val="6B7280"/>
@@ -3520,7 +3648,7 @@
       </w:r>
       <w:r>
         <w:rPr>
-          <w:rFonts w:ascii="Inter" w:hAnsi="Inter"/>
+          <w:rFonts w:ascii="Lato" w:hAnsi="Lato"/>
           <w:b w:val="0"/>
           <w:i w:val="0"/>
           <w:color w:val="6B7280"/>
@@ -3530,7 +3658,7 @@
       </w:r>
       <w:r>
         <w:rPr>
-          <w:rFonts w:ascii="Inter" w:hAnsi="Inter"/>
+          <w:rFonts w:ascii="Lato" w:hAnsi="Lato"/>
           <w:b/>
           <w:i w:val="0"/>
           <w:color w:val="D97706"/>
@@ -3546,8 +3674,8 @@
       <w:r>
         <w:drawing>
           <wp:inline xmlns:a="http://schemas.openxmlformats.org/drawingml/2006/main" xmlns:pic="http://schemas.openxmlformats.org/drawingml/2006/picture">
-            <wp:extent cx="3474720" cy="3525078"/>
-            <wp:docPr id="7" name="Picture 7"/>
+            <wp:extent cx="3474720" cy="3547185"/>
+            <wp:docPr id="8" name="Picture 8"/>
             <wp:cNvGraphicFramePr>
               <a:graphicFrameLocks noChangeAspect="1"/>
             </wp:cNvGraphicFramePr>
@@ -3559,7 +3687,7 @@
                     <pic:cNvPicPr/>
                   </pic:nvPicPr>
                   <pic:blipFill>
-                    <a:blip r:embed="rId15"/>
+                    <a:blip r:embed="rId16"/>
                     <a:stretch>
                       <a:fillRect/>
                     </a:stretch>
@@ -3567,7 +3695,7 @@
                   <pic:spPr>
                     <a:xfrm>
                       <a:off x="0" y="0"/>
-                      <a:ext cx="3474720" cy="3525078"/>
+                      <a:ext cx="3474720" cy="3547185"/>
                     </a:xfrm>
                     <a:prstGeom prst="rect"/>
                   </pic:spPr>
@@ -3585,7 +3713,7 @@
       </w:pPr>
       <w:r>
         <w:rPr>
-          <w:rFonts w:ascii="Inter" w:hAnsi="Inter"/>
+          <w:rFonts w:ascii="Lato" w:hAnsi="Lato"/>
           <w:b w:val="0"/>
           <w:i/>
           <w:color w:val="6B7280"/>
@@ -3601,7 +3729,7 @@
       </w:pPr>
       <w:r>
         <w:rPr>
-          <w:rFonts w:ascii="Inter" w:hAnsi="Inter"/>
+          <w:rFonts w:ascii="Lato" w:hAnsi="Lato"/>
           <w:b/>
           <w:color w:val="1E3A5F"/>
           <w:sz w:val="26"/>
@@ -3615,7 +3743,7 @@
       </w:pPr>
       <w:r>
         <w:rPr>
-          <w:rFonts w:ascii="Inter" w:hAnsi="Inter"/>
+          <w:rFonts w:ascii="Lato" w:hAnsi="Lato"/>
           <w:b w:val="0"/>
           <w:i w:val="0"/>
           <w:sz w:val="22"/>
@@ -3630,7 +3758,7 @@
       </w:pPr>
       <w:r>
         <w:rPr>
-          <w:rFonts w:ascii="Inter" w:hAnsi="Inter"/>
+          <w:rFonts w:ascii="Lato" w:hAnsi="Lato"/>
           <w:b/>
           <w:color w:val="1E3A5F"/>
           <w:sz w:val="26"/>
@@ -3644,7 +3772,7 @@
       </w:pPr>
       <w:r>
         <w:rPr>
-          <w:rFonts w:ascii="Inter" w:hAnsi="Inter"/>
+          <w:rFonts w:ascii="Lato" w:hAnsi="Lato"/>
           <w:b w:val="0"/>
           <w:i w:val="0"/>
           <w:sz w:val="22"/>
@@ -3659,7 +3787,7 @@
       </w:pPr>
       <w:r>
         <w:rPr>
-          <w:rFonts w:ascii="Inter" w:hAnsi="Inter"/>
+          <w:rFonts w:ascii="Lato" w:hAnsi="Lato"/>
           <w:b/>
           <w:color w:val="1E3A5F"/>
           <w:sz w:val="26"/>
@@ -3673,7 +3801,7 @@
       </w:pPr>
       <w:r>
         <w:rPr>
-          <w:rFonts w:ascii="Inter" w:hAnsi="Inter"/>
+          <w:rFonts w:ascii="Lato" w:hAnsi="Lato"/>
           <w:b w:val="0"/>
           <w:i w:val="0"/>
           <w:sz w:val="22"/>
@@ -3688,7 +3816,7 @@
       </w:pPr>
       <w:r>
         <w:rPr>
-          <w:rFonts w:ascii="Inter" w:hAnsi="Inter"/>
+          <w:rFonts w:ascii="Lato" w:hAnsi="Lato"/>
           <w:b/>
           <w:color w:val="1E3A5F"/>
           <w:sz w:val="26"/>
@@ -3702,7 +3830,7 @@
       </w:pPr>
       <w:r>
         <w:rPr>
-          <w:rFonts w:ascii="Inter" w:hAnsi="Inter"/>
+          <w:rFonts w:ascii="Lato" w:hAnsi="Lato"/>
           <w:b w:val="0"/>
           <w:i w:val="0"/>
           <w:sz w:val="22"/>
@@ -3717,7 +3845,7 @@
       </w:pPr>
       <w:r>
         <w:rPr>
-          <w:rFonts w:ascii="Inter" w:hAnsi="Inter"/>
+          <w:rFonts w:ascii="Lato" w:hAnsi="Lato"/>
           <w:b/>
           <w:color w:val="1E3A5F"/>
           <w:sz w:val="26"/>
@@ -3731,7 +3859,7 @@
       </w:pPr>
       <w:r>
         <w:rPr>
-          <w:rFonts w:ascii="Inter" w:hAnsi="Inter"/>
+          <w:rFonts w:ascii="Lato" w:hAnsi="Lato"/>
           <w:b w:val="0"/>
           <w:i w:val="0"/>
           <w:sz w:val="22"/>
@@ -3746,7 +3874,7 @@
       </w:pPr>
       <w:r>
         <w:rPr>
-          <w:rFonts w:ascii="Inter" w:hAnsi="Inter"/>
+          <w:rFonts w:ascii="Lato" w:hAnsi="Lato"/>
           <w:b/>
           <w:color w:val="1E3A5F"/>
           <w:sz w:val="26"/>
@@ -3761,7 +3889,7 @@
       </w:pPr>
       <w:r>
         <w:rPr>
-          <w:rFonts w:ascii="Inter" w:hAnsi="Inter"/>
+          <w:rFonts w:ascii="Lato" w:hAnsi="Lato"/>
           <w:b w:val="0"/>
           <w:i/>
           <w:color w:val="374151"/>
@@ -3771,7 +3899,7 @@
       </w:r>
       <w:r>
         <w:rPr>
-          <w:rFonts w:ascii="Inter" w:hAnsi="Inter"/>
+          <w:rFonts w:ascii="Lato" w:hAnsi="Lato"/>
           <w:b w:val="0"/>
           <w:i w:val="0"/>
           <w:color w:val="6B7280"/>
@@ -3787,7 +3915,7 @@
       </w:pPr>
       <w:r>
         <w:rPr>
-          <w:rFonts w:ascii="Inter" w:hAnsi="Inter"/>
+          <w:rFonts w:ascii="Lato" w:hAnsi="Lato"/>
           <w:b w:val="0"/>
           <w:i/>
           <w:color w:val="374151"/>
@@ -3799,7 +3927,7 @@
       </w:r>
       <w:r>
         <w:rPr>
-          <w:rFonts w:ascii="Inter" w:hAnsi="Inter"/>
+          <w:rFonts w:ascii="Lato" w:hAnsi="Lato"/>
           <w:b w:val="0"/>
           <w:i w:val="0"/>
           <w:color w:val="6B7280"/>
@@ -3815,7 +3943,7 @@
       </w:pPr>
       <w:r>
         <w:rPr>
-          <w:rFonts w:ascii="Inter" w:hAnsi="Inter"/>
+          <w:rFonts w:ascii="Lato" w:hAnsi="Lato"/>
           <w:b w:val="0"/>
           <w:i/>
           <w:color w:val="374151"/>
@@ -3831,7 +3959,7 @@
       </w:r>
       <w:r>
         <w:rPr>
-          <w:rFonts w:ascii="Inter" w:hAnsi="Inter"/>
+          <w:rFonts w:ascii="Lato" w:hAnsi="Lato"/>
           <w:b w:val="0"/>
           <w:i w:val="0"/>
           <w:color w:val="6B7280"/>
@@ -3855,7 +3983,7 @@
       </w:pPr>
       <w:r>
         <w:rPr>
-          <w:rFonts w:ascii="Inter" w:hAnsi="Inter"/>
+          <w:rFonts w:ascii="Lato" w:hAnsi="Lato"/>
           <w:b/>
           <w:color w:val="1E3A5F"/>
           <w:sz w:val="32"/>
@@ -3869,7 +3997,7 @@
       </w:pPr>
       <w:r>
         <w:rPr>
-          <w:rFonts w:ascii="Inter" w:hAnsi="Inter"/>
+          <w:rFonts w:ascii="Lato" w:hAnsi="Lato"/>
           <w:b w:val="0"/>
           <w:i w:val="0"/>
           <w:color w:val="6B7280"/>
@@ -3879,7 +4007,7 @@
       </w:r>
       <w:r>
         <w:rPr>
-          <w:rFonts w:ascii="Inter" w:hAnsi="Inter"/>
+          <w:rFonts w:ascii="Lato" w:hAnsi="Lato"/>
           <w:b w:val="0"/>
           <w:i w:val="0"/>
           <w:color w:val="374151"/>
@@ -3889,7 +4017,7 @@
       </w:r>
       <w:r>
         <w:rPr>
-          <w:rFonts w:ascii="Inter" w:hAnsi="Inter"/>
+          <w:rFonts w:ascii="Lato" w:hAnsi="Lato"/>
           <w:b/>
           <w:i w:val="0"/>
           <w:color w:val="059669"/>
@@ -3899,7 +4027,7 @@
       </w:r>
       <w:r>
         <w:rPr>
-          <w:rFonts w:ascii="Inter" w:hAnsi="Inter"/>
+          <w:rFonts w:ascii="Lato" w:hAnsi="Lato"/>
           <w:b w:val="0"/>
           <w:i w:val="0"/>
           <w:color w:val="374151"/>
@@ -3909,7 +4037,7 @@
       </w:r>
       <w:r>
         <w:rPr>
-          <w:rFonts w:ascii="Inter" w:hAnsi="Inter"/>
+          <w:rFonts w:ascii="Lato" w:hAnsi="Lato"/>
           <w:b/>
           <w:i w:val="0"/>
           <w:color w:val="374151"/>
@@ -3919,7 +4047,7 @@
       </w:r>
       <w:r>
         <w:rPr>
-          <w:rFonts w:ascii="Inter" w:hAnsi="Inter"/>
+          <w:rFonts w:ascii="Lato" w:hAnsi="Lato"/>
           <w:b w:val="0"/>
           <w:i w:val="0"/>
           <w:color w:val="6B7280"/>
@@ -3929,7 +4057,7 @@
       </w:r>
       <w:r>
         <w:rPr>
-          <w:rFonts w:ascii="Inter" w:hAnsi="Inter"/>
+          <w:rFonts w:ascii="Lato" w:hAnsi="Lato"/>
           <w:b w:val="0"/>
           <w:i w:val="0"/>
           <w:color w:val="6B7280"/>
@@ -3939,7 +4067,7 @@
       </w:r>
       <w:r>
         <w:rPr>
-          <w:rFonts w:ascii="Inter" w:hAnsi="Inter"/>
+          <w:rFonts w:ascii="Lato" w:hAnsi="Lato"/>
           <w:b/>
           <w:i w:val="0"/>
           <w:color w:val="059669"/>
@@ -3955,8 +4083,8 @@
       <w:r>
         <w:drawing>
           <wp:inline xmlns:a="http://schemas.openxmlformats.org/drawingml/2006/main" xmlns:pic="http://schemas.openxmlformats.org/drawingml/2006/picture">
-            <wp:extent cx="3474720" cy="3525078"/>
-            <wp:docPr id="8" name="Picture 8"/>
+            <wp:extent cx="3474720" cy="3547185"/>
+            <wp:docPr id="9" name="Picture 9"/>
             <wp:cNvGraphicFramePr>
               <a:graphicFrameLocks noChangeAspect="1"/>
             </wp:cNvGraphicFramePr>
@@ -3968,7 +4096,7 @@
                     <pic:cNvPicPr/>
                   </pic:nvPicPr>
                   <pic:blipFill>
-                    <a:blip r:embed="rId16"/>
+                    <a:blip r:embed="rId17"/>
                     <a:stretch>
                       <a:fillRect/>
                     </a:stretch>
@@ -3976,7 +4104,7 @@
                   <pic:spPr>
                     <a:xfrm>
                       <a:off x="0" y="0"/>
-                      <a:ext cx="3474720" cy="3525078"/>
+                      <a:ext cx="3474720" cy="3547185"/>
                     </a:xfrm>
                     <a:prstGeom prst="rect"/>
                   </pic:spPr>
@@ -3994,7 +4122,7 @@
       </w:pPr>
       <w:r>
         <w:rPr>
-          <w:rFonts w:ascii="Inter" w:hAnsi="Inter"/>
+          <w:rFonts w:ascii="Lato" w:hAnsi="Lato"/>
           <w:b w:val="0"/>
           <w:i/>
           <w:color w:val="6B7280"/>
@@ -4010,7 +4138,7 @@
       </w:pPr>
       <w:r>
         <w:rPr>
-          <w:rFonts w:ascii="Inter" w:hAnsi="Inter"/>
+          <w:rFonts w:ascii="Lato" w:hAnsi="Lato"/>
           <w:b/>
           <w:color w:val="1E3A5F"/>
           <w:sz w:val="26"/>
@@ -4024,7 +4152,7 @@
       </w:pPr>
       <w:r>
         <w:rPr>
-          <w:rFonts w:ascii="Inter" w:hAnsi="Inter"/>
+          <w:rFonts w:ascii="Lato" w:hAnsi="Lato"/>
           <w:b w:val="0"/>
           <w:i w:val="0"/>
           <w:sz w:val="22"/>
@@ -4039,7 +4167,7 @@
       </w:pPr>
       <w:r>
         <w:rPr>
-          <w:rFonts w:ascii="Inter" w:hAnsi="Inter"/>
+          <w:rFonts w:ascii="Lato" w:hAnsi="Lato"/>
           <w:b/>
           <w:color w:val="1E3A5F"/>
           <w:sz w:val="26"/>
@@ -4053,7 +4181,7 @@
       </w:pPr>
       <w:r>
         <w:rPr>
-          <w:rFonts w:ascii="Inter" w:hAnsi="Inter"/>
+          <w:rFonts w:ascii="Lato" w:hAnsi="Lato"/>
           <w:b w:val="0"/>
           <w:i w:val="0"/>
           <w:sz w:val="22"/>
@@ -4068,7 +4196,7 @@
       </w:pPr>
       <w:r>
         <w:rPr>
-          <w:rFonts w:ascii="Inter" w:hAnsi="Inter"/>
+          <w:rFonts w:ascii="Lato" w:hAnsi="Lato"/>
           <w:b/>
           <w:color w:val="1E3A5F"/>
           <w:sz w:val="26"/>
@@ -4082,7 +4210,7 @@
       </w:pPr>
       <w:r>
         <w:rPr>
-          <w:rFonts w:ascii="Inter" w:hAnsi="Inter"/>
+          <w:rFonts w:ascii="Lato" w:hAnsi="Lato"/>
           <w:b w:val="0"/>
           <w:i w:val="0"/>
           <w:sz w:val="22"/>
@@ -4097,7 +4225,7 @@
       </w:pPr>
       <w:r>
         <w:rPr>
-          <w:rFonts w:ascii="Inter" w:hAnsi="Inter"/>
+          <w:rFonts w:ascii="Lato" w:hAnsi="Lato"/>
           <w:b/>
           <w:color w:val="1E3A5F"/>
           <w:sz w:val="26"/>
@@ -4111,7 +4239,7 @@
       </w:pPr>
       <w:r>
         <w:rPr>
-          <w:rFonts w:ascii="Inter" w:hAnsi="Inter"/>
+          <w:rFonts w:ascii="Lato" w:hAnsi="Lato"/>
           <w:b w:val="0"/>
           <w:i w:val="0"/>
           <w:sz w:val="22"/>
@@ -4126,7 +4254,7 @@
       </w:pPr>
       <w:r>
         <w:rPr>
-          <w:rFonts w:ascii="Inter" w:hAnsi="Inter"/>
+          <w:rFonts w:ascii="Lato" w:hAnsi="Lato"/>
           <w:b/>
           <w:color w:val="1E3A5F"/>
           <w:sz w:val="26"/>
@@ -4140,7 +4268,7 @@
       </w:pPr>
       <w:r>
         <w:rPr>
-          <w:rFonts w:ascii="Inter" w:hAnsi="Inter"/>
+          <w:rFonts w:ascii="Lato" w:hAnsi="Lato"/>
           <w:b w:val="0"/>
           <w:i w:val="0"/>
           <w:sz w:val="22"/>
@@ -4155,7 +4283,7 @@
       </w:pPr>
       <w:r>
         <w:rPr>
-          <w:rFonts w:ascii="Inter" w:hAnsi="Inter"/>
+          <w:rFonts w:ascii="Lato" w:hAnsi="Lato"/>
           <w:b/>
           <w:color w:val="1E3A5F"/>
           <w:sz w:val="26"/>
@@ -4170,7 +4298,7 @@
       </w:pPr>
       <w:r>
         <w:rPr>
-          <w:rFonts w:ascii="Inter" w:hAnsi="Inter"/>
+          <w:rFonts w:ascii="Lato" w:hAnsi="Lato"/>
           <w:b w:val="0"/>
           <w:i/>
           <w:color w:val="374151"/>
@@ -4180,7 +4308,7 @@
       </w:r>
       <w:r>
         <w:rPr>
-          <w:rFonts w:ascii="Inter" w:hAnsi="Inter"/>
+          <w:rFonts w:ascii="Lato" w:hAnsi="Lato"/>
           <w:b w:val="0"/>
           <w:i w:val="0"/>
           <w:color w:val="6B7280"/>
@@ -4196,7 +4324,7 @@
       </w:pPr>
       <w:r>
         <w:rPr>
-          <w:rFonts w:ascii="Inter" w:hAnsi="Inter"/>
+          <w:rFonts w:ascii="Lato" w:hAnsi="Lato"/>
           <w:b w:val="0"/>
           <w:i/>
           <w:color w:val="374151"/>
@@ -4206,7 +4334,7 @@
       </w:r>
       <w:r>
         <w:rPr>
-          <w:rFonts w:ascii="Inter" w:hAnsi="Inter"/>
+          <w:rFonts w:ascii="Lato" w:hAnsi="Lato"/>
           <w:b w:val="0"/>
           <w:i w:val="0"/>
           <w:color w:val="6B7280"/>
@@ -4222,7 +4350,7 @@
       </w:pPr>
       <w:r>
         <w:rPr>
-          <w:rFonts w:ascii="Inter" w:hAnsi="Inter"/>
+          <w:rFonts w:ascii="Lato" w:hAnsi="Lato"/>
           <w:b w:val="0"/>
           <w:i/>
           <w:color w:val="374151"/>
@@ -4240,7 +4368,7 @@
       </w:r>
       <w:r>
         <w:rPr>
-          <w:rFonts w:ascii="Inter" w:hAnsi="Inter"/>
+          <w:rFonts w:ascii="Lato" w:hAnsi="Lato"/>
           <w:b w:val="0"/>
           <w:i w:val="0"/>
           <w:color w:val="6B7280"/>
@@ -4264,7 +4392,7 @@
       </w:pPr>
       <w:r>
         <w:rPr>
-          <w:rFonts w:ascii="Inter" w:hAnsi="Inter"/>
+          <w:rFonts w:ascii="Lato" w:hAnsi="Lato"/>
           <w:b/>
           <w:color w:val="1E3A5F"/>
           <w:sz w:val="32"/>
@@ -4278,7 +4406,7 @@
       </w:pPr>
       <w:r>
         <w:rPr>
-          <w:rFonts w:ascii="Inter" w:hAnsi="Inter"/>
+          <w:rFonts w:ascii="Lato" w:hAnsi="Lato"/>
           <w:b w:val="0"/>
           <w:i w:val="0"/>
           <w:color w:val="6B7280"/>
@@ -4288,7 +4416,7 @@
       </w:r>
       <w:r>
         <w:rPr>
-          <w:rFonts w:ascii="Inter" w:hAnsi="Inter"/>
+          <w:rFonts w:ascii="Lato" w:hAnsi="Lato"/>
           <w:b w:val="0"/>
           <w:i w:val="0"/>
           <w:color w:val="374151"/>
@@ -4298,7 +4426,7 @@
       </w:r>
       <w:r>
         <w:rPr>
-          <w:rFonts w:ascii="Inter" w:hAnsi="Inter"/>
+          <w:rFonts w:ascii="Lato" w:hAnsi="Lato"/>
           <w:b/>
           <w:i w:val="0"/>
           <w:color w:val="059669"/>
@@ -4308,7 +4436,7 @@
       </w:r>
       <w:r>
         <w:rPr>
-          <w:rFonts w:ascii="Inter" w:hAnsi="Inter"/>
+          <w:rFonts w:ascii="Lato" w:hAnsi="Lato"/>
           <w:b w:val="0"/>
           <w:i w:val="0"/>
           <w:color w:val="374151"/>
@@ -4318,7 +4446,7 @@
       </w:r>
       <w:r>
         <w:rPr>
-          <w:rFonts w:ascii="Inter" w:hAnsi="Inter"/>
+          <w:rFonts w:ascii="Lato" w:hAnsi="Lato"/>
           <w:b/>
           <w:i w:val="0"/>
           <w:color w:val="374151"/>
@@ -4328,7 +4456,7 @@
       </w:r>
       <w:r>
         <w:rPr>
-          <w:rFonts w:ascii="Inter" w:hAnsi="Inter"/>
+          <w:rFonts w:ascii="Lato" w:hAnsi="Lato"/>
           <w:b w:val="0"/>
           <w:i w:val="0"/>
           <w:color w:val="6B7280"/>
@@ -4338,7 +4466,7 @@
       </w:r>
       <w:r>
         <w:rPr>
-          <w:rFonts w:ascii="Inter" w:hAnsi="Inter"/>
+          <w:rFonts w:ascii="Lato" w:hAnsi="Lato"/>
           <w:b w:val="0"/>
           <w:i w:val="0"/>
           <w:color w:val="6B7280"/>
@@ -4348,7 +4476,7 @@
       </w:r>
       <w:r>
         <w:rPr>
-          <w:rFonts w:ascii="Inter" w:hAnsi="Inter"/>
+          <w:rFonts w:ascii="Lato" w:hAnsi="Lato"/>
           <w:b/>
           <w:i w:val="0"/>
           <w:color w:val="059669"/>
@@ -4364,8 +4492,8 @@
       <w:r>
         <w:drawing>
           <wp:inline xmlns:a="http://schemas.openxmlformats.org/drawingml/2006/main" xmlns:pic="http://schemas.openxmlformats.org/drawingml/2006/picture">
-            <wp:extent cx="3474720" cy="3525078"/>
-            <wp:docPr id="9" name="Picture 9"/>
+            <wp:extent cx="3474720" cy="3547185"/>
+            <wp:docPr id="10" name="Picture 10"/>
             <wp:cNvGraphicFramePr>
               <a:graphicFrameLocks noChangeAspect="1"/>
             </wp:cNvGraphicFramePr>
@@ -4377,7 +4505,7 @@
                     <pic:cNvPicPr/>
                   </pic:nvPicPr>
                   <pic:blipFill>
-                    <a:blip r:embed="rId17"/>
+                    <a:blip r:embed="rId18"/>
                     <a:stretch>
                       <a:fillRect/>
                     </a:stretch>
@@ -4385,7 +4513,7 @@
                   <pic:spPr>
                     <a:xfrm>
                       <a:off x="0" y="0"/>
-                      <a:ext cx="3474720" cy="3525078"/>
+                      <a:ext cx="3474720" cy="3547185"/>
                     </a:xfrm>
                     <a:prstGeom prst="rect"/>
                   </pic:spPr>
@@ -4403,7 +4531,7 @@
       </w:pPr>
       <w:r>
         <w:rPr>
-          <w:rFonts w:ascii="Inter" w:hAnsi="Inter"/>
+          <w:rFonts w:ascii="Lato" w:hAnsi="Lato"/>
           <w:b w:val="0"/>
           <w:i/>
           <w:color w:val="6B7280"/>
@@ -4419,7 +4547,7 @@
       </w:pPr>
       <w:r>
         <w:rPr>
-          <w:rFonts w:ascii="Inter" w:hAnsi="Inter"/>
+          <w:rFonts w:ascii="Lato" w:hAnsi="Lato"/>
           <w:b/>
           <w:color w:val="1E3A5F"/>
           <w:sz w:val="26"/>
@@ -4433,7 +4561,7 @@
       </w:pPr>
       <w:r>
         <w:rPr>
-          <w:rFonts w:ascii="Inter" w:hAnsi="Inter"/>
+          <w:rFonts w:ascii="Lato" w:hAnsi="Lato"/>
           <w:b w:val="0"/>
           <w:i w:val="0"/>
           <w:sz w:val="22"/>
@@ -4448,7 +4576,7 @@
       </w:pPr>
       <w:r>
         <w:rPr>
-          <w:rFonts w:ascii="Inter" w:hAnsi="Inter"/>
+          <w:rFonts w:ascii="Lato" w:hAnsi="Lato"/>
           <w:b/>
           <w:color w:val="1E3A5F"/>
           <w:sz w:val="26"/>
@@ -4462,7 +4590,7 @@
       </w:pPr>
       <w:r>
         <w:rPr>
-          <w:rFonts w:ascii="Inter" w:hAnsi="Inter"/>
+          <w:rFonts w:ascii="Lato" w:hAnsi="Lato"/>
           <w:b w:val="0"/>
           <w:i w:val="0"/>
           <w:sz w:val="22"/>
@@ -4477,7 +4605,7 @@
       </w:pPr>
       <w:r>
         <w:rPr>
-          <w:rFonts w:ascii="Inter" w:hAnsi="Inter"/>
+          <w:rFonts w:ascii="Lato" w:hAnsi="Lato"/>
           <w:b/>
           <w:color w:val="1E3A5F"/>
           <w:sz w:val="26"/>
@@ -4491,7 +4619,7 @@
       </w:pPr>
       <w:r>
         <w:rPr>
-          <w:rFonts w:ascii="Inter" w:hAnsi="Inter"/>
+          <w:rFonts w:ascii="Lato" w:hAnsi="Lato"/>
           <w:b w:val="0"/>
           <w:i w:val="0"/>
           <w:sz w:val="22"/>
@@ -4506,7 +4634,7 @@
       </w:pPr>
       <w:r>
         <w:rPr>
-          <w:rFonts w:ascii="Inter" w:hAnsi="Inter"/>
+          <w:rFonts w:ascii="Lato" w:hAnsi="Lato"/>
           <w:b/>
           <w:color w:val="1E3A5F"/>
           <w:sz w:val="26"/>
@@ -4520,7 +4648,7 @@
       </w:pPr>
       <w:r>
         <w:rPr>
-          <w:rFonts w:ascii="Inter" w:hAnsi="Inter"/>
+          <w:rFonts w:ascii="Lato" w:hAnsi="Lato"/>
           <w:b w:val="0"/>
           <w:i w:val="0"/>
           <w:sz w:val="22"/>
@@ -4535,7 +4663,7 @@
       </w:pPr>
       <w:r>
         <w:rPr>
-          <w:rFonts w:ascii="Inter" w:hAnsi="Inter"/>
+          <w:rFonts w:ascii="Lato" w:hAnsi="Lato"/>
           <w:b/>
           <w:color w:val="1E3A5F"/>
           <w:sz w:val="26"/>
@@ -4549,7 +4677,7 @@
       </w:pPr>
       <w:r>
         <w:rPr>
-          <w:rFonts w:ascii="Inter" w:hAnsi="Inter"/>
+          <w:rFonts w:ascii="Lato" w:hAnsi="Lato"/>
           <w:b w:val="0"/>
           <w:i w:val="0"/>
           <w:sz w:val="22"/>
@@ -4564,7 +4692,7 @@
       </w:pPr>
       <w:r>
         <w:rPr>
-          <w:rFonts w:ascii="Inter" w:hAnsi="Inter"/>
+          <w:rFonts w:ascii="Lato" w:hAnsi="Lato"/>
           <w:b/>
           <w:color w:val="1E3A5F"/>
           <w:sz w:val="26"/>
@@ -4579,7 +4707,7 @@
       </w:pPr>
       <w:r>
         <w:rPr>
-          <w:rFonts w:ascii="Inter" w:hAnsi="Inter"/>
+          <w:rFonts w:ascii="Lato" w:hAnsi="Lato"/>
           <w:b w:val="0"/>
           <w:i/>
           <w:color w:val="374151"/>
@@ -4589,7 +4717,7 @@
       </w:r>
       <w:r>
         <w:rPr>
-          <w:rFonts w:ascii="Inter" w:hAnsi="Inter"/>
+          <w:rFonts w:ascii="Lato" w:hAnsi="Lato"/>
           <w:b w:val="0"/>
           <w:i w:val="0"/>
           <w:color w:val="6B7280"/>
@@ -4605,7 +4733,7 @@
       </w:pPr>
       <w:r>
         <w:rPr>
-          <w:rFonts w:ascii="Inter" w:hAnsi="Inter"/>
+          <w:rFonts w:ascii="Lato" w:hAnsi="Lato"/>
           <w:b w:val="0"/>
           <w:i/>
           <w:color w:val="374151"/>
@@ -4615,7 +4743,7 @@
       </w:r>
       <w:r>
         <w:rPr>
-          <w:rFonts w:ascii="Inter" w:hAnsi="Inter"/>
+          <w:rFonts w:ascii="Lato" w:hAnsi="Lato"/>
           <w:b w:val="0"/>
           <w:i w:val="0"/>
           <w:color w:val="6B7280"/>
@@ -4631,7 +4759,7 @@
       </w:pPr>
       <w:r>
         <w:rPr>
-          <w:rFonts w:ascii="Inter" w:hAnsi="Inter"/>
+          <w:rFonts w:ascii="Lato" w:hAnsi="Lato"/>
           <w:b w:val="0"/>
           <w:i/>
           <w:color w:val="374151"/>
@@ -4641,7 +4769,7 @@
       </w:r>
       <w:r>
         <w:rPr>
-          <w:rFonts w:ascii="Inter" w:hAnsi="Inter"/>
+          <w:rFonts w:ascii="Lato" w:hAnsi="Lato"/>
           <w:b w:val="0"/>
           <w:i w:val="0"/>
           <w:color w:val="6B7280"/>
@@ -4665,7 +4793,7 @@
       </w:pPr>
       <w:r>
         <w:rPr>
-          <w:rFonts w:ascii="Inter" w:hAnsi="Inter"/>
+          <w:rFonts w:ascii="Lato" w:hAnsi="Lato"/>
           <w:b/>
           <w:color w:val="1E3A5F"/>
           <w:sz w:val="32"/>
@@ -4679,7 +4807,7 @@
       </w:pPr>
       <w:r>
         <w:rPr>
-          <w:rFonts w:ascii="Inter" w:hAnsi="Inter"/>
+          <w:rFonts w:ascii="Lato" w:hAnsi="Lato"/>
           <w:b w:val="0"/>
           <w:i w:val="0"/>
           <w:color w:val="6B7280"/>
@@ -4689,7 +4817,7 @@
       </w:r>
       <w:r>
         <w:rPr>
-          <w:rFonts w:ascii="Inter" w:hAnsi="Inter"/>
+          <w:rFonts w:ascii="Lato" w:hAnsi="Lato"/>
           <w:b w:val="0"/>
           <w:i w:val="0"/>
           <w:color w:val="374151"/>
@@ -4699,7 +4827,7 @@
       </w:r>
       <w:r>
         <w:rPr>
-          <w:rFonts w:ascii="Inter" w:hAnsi="Inter"/>
+          <w:rFonts w:ascii="Lato" w:hAnsi="Lato"/>
           <w:b/>
           <w:i w:val="0"/>
           <w:color w:val="059669"/>
@@ -4709,7 +4837,7 @@
       </w:r>
       <w:r>
         <w:rPr>
-          <w:rFonts w:ascii="Inter" w:hAnsi="Inter"/>
+          <w:rFonts w:ascii="Lato" w:hAnsi="Lato"/>
           <w:b w:val="0"/>
           <w:i w:val="0"/>
           <w:color w:val="374151"/>
@@ -4719,7 +4847,7 @@
       </w:r>
       <w:r>
         <w:rPr>
-          <w:rFonts w:ascii="Inter" w:hAnsi="Inter"/>
+          <w:rFonts w:ascii="Lato" w:hAnsi="Lato"/>
           <w:b/>
           <w:i w:val="0"/>
           <w:color w:val="374151"/>
@@ -4729,7 +4857,7 @@
       </w:r>
       <w:r>
         <w:rPr>
-          <w:rFonts w:ascii="Inter" w:hAnsi="Inter"/>
+          <w:rFonts w:ascii="Lato" w:hAnsi="Lato"/>
           <w:b w:val="0"/>
           <w:i w:val="0"/>
           <w:color w:val="6B7280"/>
@@ -4739,7 +4867,7 @@
       </w:r>
       <w:r>
         <w:rPr>
-          <w:rFonts w:ascii="Inter" w:hAnsi="Inter"/>
+          <w:rFonts w:ascii="Lato" w:hAnsi="Lato"/>
           <w:b w:val="0"/>
           <w:i w:val="0"/>
           <w:color w:val="6B7280"/>
@@ -4749,7 +4877,7 @@
       </w:r>
       <w:r>
         <w:rPr>
-          <w:rFonts w:ascii="Inter" w:hAnsi="Inter"/>
+          <w:rFonts w:ascii="Lato" w:hAnsi="Lato"/>
           <w:b/>
           <w:i w:val="0"/>
           <w:color w:val="DC2626"/>
@@ -4765,8 +4893,8 @@
       <w:r>
         <w:drawing>
           <wp:inline xmlns:a="http://schemas.openxmlformats.org/drawingml/2006/main" xmlns:pic="http://schemas.openxmlformats.org/drawingml/2006/picture">
-            <wp:extent cx="3474720" cy="3517840"/>
-            <wp:docPr id="10" name="Picture 10"/>
+            <wp:extent cx="3474720" cy="3547185"/>
+            <wp:docPr id="11" name="Picture 11"/>
             <wp:cNvGraphicFramePr>
               <a:graphicFrameLocks noChangeAspect="1"/>
             </wp:cNvGraphicFramePr>
@@ -4778,7 +4906,7 @@
                     <pic:cNvPicPr/>
                   </pic:nvPicPr>
                   <pic:blipFill>
-                    <a:blip r:embed="rId18"/>
+                    <a:blip r:embed="rId19"/>
                     <a:stretch>
                       <a:fillRect/>
                     </a:stretch>
@@ -4786,7 +4914,7 @@
                   <pic:spPr>
                     <a:xfrm>
                       <a:off x="0" y="0"/>
-                      <a:ext cx="3474720" cy="3517840"/>
+                      <a:ext cx="3474720" cy="3547185"/>
                     </a:xfrm>
                     <a:prstGeom prst="rect"/>
                   </pic:spPr>
@@ -4804,7 +4932,7 @@
       </w:pPr>
       <w:r>
         <w:rPr>
-          <w:rFonts w:ascii="Inter" w:hAnsi="Inter"/>
+          <w:rFonts w:ascii="Lato" w:hAnsi="Lato"/>
           <w:b w:val="0"/>
           <w:i/>
           <w:color w:val="6B7280"/>
@@ -4820,7 +4948,7 @@
       </w:pPr>
       <w:r>
         <w:rPr>
-          <w:rFonts w:ascii="Inter" w:hAnsi="Inter"/>
+          <w:rFonts w:ascii="Lato" w:hAnsi="Lato"/>
           <w:b/>
           <w:color w:val="1E3A5F"/>
           <w:sz w:val="26"/>
@@ -4834,7 +4962,7 @@
       </w:pPr>
       <w:r>
         <w:rPr>
-          <w:rFonts w:ascii="Inter" w:hAnsi="Inter"/>
+          <w:rFonts w:ascii="Lato" w:hAnsi="Lato"/>
           <w:b w:val="0"/>
           <w:i w:val="0"/>
           <w:sz w:val="22"/>
@@ -4849,7 +4977,7 @@
       </w:pPr>
       <w:r>
         <w:rPr>
-          <w:rFonts w:ascii="Inter" w:hAnsi="Inter"/>
+          <w:rFonts w:ascii="Lato" w:hAnsi="Lato"/>
           <w:b/>
           <w:color w:val="1E3A5F"/>
           <w:sz w:val="26"/>
@@ -4863,7 +4991,7 @@
       </w:pPr>
       <w:r>
         <w:rPr>
-          <w:rFonts w:ascii="Inter" w:hAnsi="Inter"/>
+          <w:rFonts w:ascii="Lato" w:hAnsi="Lato"/>
           <w:b w:val="0"/>
           <w:i w:val="0"/>
           <w:sz w:val="22"/>
@@ -4878,7 +5006,7 @@
       </w:pPr>
       <w:r>
         <w:rPr>
-          <w:rFonts w:ascii="Inter" w:hAnsi="Inter"/>
+          <w:rFonts w:ascii="Lato" w:hAnsi="Lato"/>
           <w:b/>
           <w:color w:val="1E3A5F"/>
           <w:sz w:val="26"/>
@@ -4892,7 +5020,7 @@
       </w:pPr>
       <w:r>
         <w:rPr>
-          <w:rFonts w:ascii="Inter" w:hAnsi="Inter"/>
+          <w:rFonts w:ascii="Lato" w:hAnsi="Lato"/>
           <w:b w:val="0"/>
           <w:i w:val="0"/>
           <w:sz w:val="22"/>
@@ -4907,7 +5035,7 @@
       </w:pPr>
       <w:r>
         <w:rPr>
-          <w:rFonts w:ascii="Inter" w:hAnsi="Inter"/>
+          <w:rFonts w:ascii="Lato" w:hAnsi="Lato"/>
           <w:b/>
           <w:color w:val="1E3A5F"/>
           <w:sz w:val="26"/>
@@ -4921,7 +5049,7 @@
       </w:pPr>
       <w:r>
         <w:rPr>
-          <w:rFonts w:ascii="Inter" w:hAnsi="Inter"/>
+          <w:rFonts w:ascii="Lato" w:hAnsi="Lato"/>
           <w:b w:val="0"/>
           <w:i w:val="0"/>
           <w:sz w:val="22"/>
@@ -4936,7 +5064,7 @@
       </w:pPr>
       <w:r>
         <w:rPr>
-          <w:rFonts w:ascii="Inter" w:hAnsi="Inter"/>
+          <w:rFonts w:ascii="Lato" w:hAnsi="Lato"/>
           <w:b/>
           <w:color w:val="1E3A5F"/>
           <w:sz w:val="26"/>
@@ -4950,7 +5078,7 @@
       </w:pPr>
       <w:r>
         <w:rPr>
-          <w:rFonts w:ascii="Inter" w:hAnsi="Inter"/>
+          <w:rFonts w:ascii="Lato" w:hAnsi="Lato"/>
           <w:b w:val="0"/>
           <w:i w:val="0"/>
           <w:sz w:val="22"/>
@@ -4965,7 +5093,7 @@
       </w:pPr>
       <w:r>
         <w:rPr>
-          <w:rFonts w:ascii="Inter" w:hAnsi="Inter"/>
+          <w:rFonts w:ascii="Lato" w:hAnsi="Lato"/>
           <w:b/>
           <w:color w:val="1E3A5F"/>
           <w:sz w:val="26"/>
@@ -4980,7 +5108,7 @@
       </w:pPr>
       <w:r>
         <w:rPr>
-          <w:rFonts w:ascii="Inter" w:hAnsi="Inter"/>
+          <w:rFonts w:ascii="Lato" w:hAnsi="Lato"/>
           <w:b w:val="0"/>
           <w:i/>
           <w:color w:val="374151"/>
@@ -4990,7 +5118,7 @@
       </w:r>
       <w:r>
         <w:rPr>
-          <w:rFonts w:ascii="Inter" w:hAnsi="Inter"/>
+          <w:rFonts w:ascii="Lato" w:hAnsi="Lato"/>
           <w:b w:val="0"/>
           <w:i w:val="0"/>
           <w:color w:val="6B7280"/>
@@ -5006,7 +5134,7 @@
       </w:pPr>
       <w:r>
         <w:rPr>
-          <w:rFonts w:ascii="Inter" w:hAnsi="Inter"/>
+          <w:rFonts w:ascii="Lato" w:hAnsi="Lato"/>
           <w:b w:val="0"/>
           <w:i/>
           <w:color w:val="374151"/>
@@ -5016,7 +5144,7 @@
       </w:r>
       <w:r>
         <w:rPr>
-          <w:rFonts w:ascii="Inter" w:hAnsi="Inter"/>
+          <w:rFonts w:ascii="Lato" w:hAnsi="Lato"/>
           <w:b w:val="0"/>
           <w:i w:val="0"/>
           <w:color w:val="6B7280"/>
@@ -5032,7 +5160,7 @@
       </w:pPr>
       <w:r>
         <w:rPr>
-          <w:rFonts w:ascii="Inter" w:hAnsi="Inter"/>
+          <w:rFonts w:ascii="Lato" w:hAnsi="Lato"/>
           <w:b w:val="0"/>
           <w:i/>
           <w:color w:val="374151"/>
@@ -5042,7 +5170,7 @@
       </w:r>
       <w:r>
         <w:rPr>
-          <w:rFonts w:ascii="Inter" w:hAnsi="Inter"/>
+          <w:rFonts w:ascii="Lato" w:hAnsi="Lato"/>
           <w:b w:val="0"/>
           <w:i w:val="0"/>
           <w:color w:val="6B7280"/>
@@ -5066,7 +5194,7 @@
       </w:pPr>
       <w:r>
         <w:rPr>
-          <w:rFonts w:ascii="Inter" w:hAnsi="Inter"/>
+          <w:rFonts w:ascii="Lato" w:hAnsi="Lato"/>
           <w:b/>
           <w:color w:val="1E3A5F"/>
           <w:sz w:val="32"/>
@@ -5080,7 +5208,7 @@
       </w:pPr>
       <w:r>
         <w:rPr>
-          <w:rFonts w:ascii="Inter" w:hAnsi="Inter"/>
+          <w:rFonts w:ascii="Lato" w:hAnsi="Lato"/>
           <w:b w:val="0"/>
           <w:i w:val="0"/>
           <w:color w:val="6B7280"/>
@@ -5090,7 +5218,7 @@
       </w:r>
       <w:r>
         <w:rPr>
-          <w:rFonts w:ascii="Inter" w:hAnsi="Inter"/>
+          <w:rFonts w:ascii="Lato" w:hAnsi="Lato"/>
           <w:b w:val="0"/>
           <w:i w:val="0"/>
           <w:color w:val="374151"/>
@@ -5100,7 +5228,7 @@
       </w:r>
       <w:r>
         <w:rPr>
-          <w:rFonts w:ascii="Inter" w:hAnsi="Inter"/>
+          <w:rFonts w:ascii="Lato" w:hAnsi="Lato"/>
           <w:b/>
           <w:i w:val="0"/>
           <w:color w:val="059669"/>
@@ -5110,7 +5238,7 @@
       </w:r>
       <w:r>
         <w:rPr>
-          <w:rFonts w:ascii="Inter" w:hAnsi="Inter"/>
+          <w:rFonts w:ascii="Lato" w:hAnsi="Lato"/>
           <w:b w:val="0"/>
           <w:i w:val="0"/>
           <w:color w:val="374151"/>
@@ -5120,7 +5248,7 @@
       </w:r>
       <w:r>
         <w:rPr>
-          <w:rFonts w:ascii="Inter" w:hAnsi="Inter"/>
+          <w:rFonts w:ascii="Lato" w:hAnsi="Lato"/>
           <w:b/>
           <w:i w:val="0"/>
           <w:color w:val="374151"/>
@@ -5130,7 +5258,7 @@
       </w:r>
       <w:r>
         <w:rPr>
-          <w:rFonts w:ascii="Inter" w:hAnsi="Inter"/>
+          <w:rFonts w:ascii="Lato" w:hAnsi="Lato"/>
           <w:b w:val="0"/>
           <w:i w:val="0"/>
           <w:color w:val="6B7280"/>
@@ -5140,7 +5268,7 @@
       </w:r>
       <w:r>
         <w:rPr>
-          <w:rFonts w:ascii="Inter" w:hAnsi="Inter"/>
+          <w:rFonts w:ascii="Lato" w:hAnsi="Lato"/>
           <w:b w:val="0"/>
           <w:i w:val="0"/>
           <w:color w:val="6B7280"/>
@@ -5150,7 +5278,7 @@
       </w:r>
       <w:r>
         <w:rPr>
-          <w:rFonts w:ascii="Inter" w:hAnsi="Inter"/>
+          <w:rFonts w:ascii="Lato" w:hAnsi="Lato"/>
           <w:b/>
           <w:i w:val="0"/>
           <w:color w:val="DC2626"/>
@@ -5166,8 +5294,8 @@
       <w:r>
         <w:drawing>
           <wp:inline xmlns:a="http://schemas.openxmlformats.org/drawingml/2006/main" xmlns:pic="http://schemas.openxmlformats.org/drawingml/2006/picture">
-            <wp:extent cx="3474720" cy="3525078"/>
-            <wp:docPr id="11" name="Picture 11"/>
+            <wp:extent cx="3474720" cy="3547185"/>
+            <wp:docPr id="12" name="Picture 12"/>
             <wp:cNvGraphicFramePr>
               <a:graphicFrameLocks noChangeAspect="1"/>
             </wp:cNvGraphicFramePr>
@@ -5179,7 +5307,7 @@
                     <pic:cNvPicPr/>
                   </pic:nvPicPr>
                   <pic:blipFill>
-                    <a:blip r:embed="rId19"/>
+                    <a:blip r:embed="rId20"/>
                     <a:stretch>
                       <a:fillRect/>
                     </a:stretch>
@@ -5187,7 +5315,7 @@
                   <pic:spPr>
                     <a:xfrm>
                       <a:off x="0" y="0"/>
-                      <a:ext cx="3474720" cy="3525078"/>
+                      <a:ext cx="3474720" cy="3547185"/>
                     </a:xfrm>
                     <a:prstGeom prst="rect"/>
                   </pic:spPr>
@@ -5205,7 +5333,7 @@
       </w:pPr>
       <w:r>
         <w:rPr>
-          <w:rFonts w:ascii="Inter" w:hAnsi="Inter"/>
+          <w:rFonts w:ascii="Lato" w:hAnsi="Lato"/>
           <w:b w:val="0"/>
           <w:i/>
           <w:color w:val="6B7280"/>
@@ -5221,7 +5349,7 @@
       </w:pPr>
       <w:r>
         <w:rPr>
-          <w:rFonts w:ascii="Inter" w:hAnsi="Inter"/>
+          <w:rFonts w:ascii="Lato" w:hAnsi="Lato"/>
           <w:b/>
           <w:color w:val="1E3A5F"/>
           <w:sz w:val="26"/>
@@ -5235,7 +5363,7 @@
       </w:pPr>
       <w:r>
         <w:rPr>
-          <w:rFonts w:ascii="Inter" w:hAnsi="Inter"/>
+          <w:rFonts w:ascii="Lato" w:hAnsi="Lato"/>
           <w:b w:val="0"/>
           <w:i w:val="0"/>
           <w:sz w:val="22"/>
@@ -5250,7 +5378,7 @@
       </w:pPr>
       <w:r>
         <w:rPr>
-          <w:rFonts w:ascii="Inter" w:hAnsi="Inter"/>
+          <w:rFonts w:ascii="Lato" w:hAnsi="Lato"/>
           <w:b/>
           <w:color w:val="1E3A5F"/>
           <w:sz w:val="26"/>
@@ -5264,7 +5392,7 @@
       </w:pPr>
       <w:r>
         <w:rPr>
-          <w:rFonts w:ascii="Inter" w:hAnsi="Inter"/>
+          <w:rFonts w:ascii="Lato" w:hAnsi="Lato"/>
           <w:b w:val="0"/>
           <w:i w:val="0"/>
           <w:sz w:val="22"/>
@@ -5279,7 +5407,7 @@
       </w:pPr>
       <w:r>
         <w:rPr>
-          <w:rFonts w:ascii="Inter" w:hAnsi="Inter"/>
+          <w:rFonts w:ascii="Lato" w:hAnsi="Lato"/>
           <w:b/>
           <w:color w:val="1E3A5F"/>
           <w:sz w:val="26"/>
@@ -5293,7 +5421,7 @@
       </w:pPr>
       <w:r>
         <w:rPr>
-          <w:rFonts w:ascii="Inter" w:hAnsi="Inter"/>
+          <w:rFonts w:ascii="Lato" w:hAnsi="Lato"/>
           <w:b w:val="0"/>
           <w:i w:val="0"/>
           <w:sz w:val="22"/>
@@ -5308,7 +5436,7 @@
       </w:pPr>
       <w:r>
         <w:rPr>
-          <w:rFonts w:ascii="Inter" w:hAnsi="Inter"/>
+          <w:rFonts w:ascii="Lato" w:hAnsi="Lato"/>
           <w:b/>
           <w:color w:val="1E3A5F"/>
           <w:sz w:val="26"/>
@@ -5322,7 +5450,7 @@
       </w:pPr>
       <w:r>
         <w:rPr>
-          <w:rFonts w:ascii="Inter" w:hAnsi="Inter"/>
+          <w:rFonts w:ascii="Lato" w:hAnsi="Lato"/>
           <w:b w:val="0"/>
           <w:i w:val="0"/>
           <w:sz w:val="22"/>
@@ -5337,7 +5465,7 @@
       </w:pPr>
       <w:r>
         <w:rPr>
-          <w:rFonts w:ascii="Inter" w:hAnsi="Inter"/>
+          <w:rFonts w:ascii="Lato" w:hAnsi="Lato"/>
           <w:b/>
           <w:color w:val="1E3A5F"/>
           <w:sz w:val="26"/>
@@ -5351,7 +5479,7 @@
       </w:pPr>
       <w:r>
         <w:rPr>
-          <w:rFonts w:ascii="Inter" w:hAnsi="Inter"/>
+          <w:rFonts w:ascii="Lato" w:hAnsi="Lato"/>
           <w:b w:val="0"/>
           <w:i w:val="0"/>
           <w:sz w:val="22"/>
@@ -5366,7 +5494,7 @@
       </w:pPr>
       <w:r>
         <w:rPr>
-          <w:rFonts w:ascii="Inter" w:hAnsi="Inter"/>
+          <w:rFonts w:ascii="Lato" w:hAnsi="Lato"/>
           <w:b/>
           <w:color w:val="1E3A5F"/>
           <w:sz w:val="26"/>
@@ -5381,7 +5509,7 @@
       </w:pPr>
       <w:r>
         <w:rPr>
-          <w:rFonts w:ascii="Inter" w:hAnsi="Inter"/>
+          <w:rFonts w:ascii="Lato" w:hAnsi="Lato"/>
           <w:b w:val="0"/>
           <w:i/>
           <w:color w:val="374151"/>
@@ -5393,7 +5521,7 @@
       </w:r>
       <w:r>
         <w:rPr>
-          <w:rFonts w:ascii="Inter" w:hAnsi="Inter"/>
+          <w:rFonts w:ascii="Lato" w:hAnsi="Lato"/>
           <w:b w:val="0"/>
           <w:i w:val="0"/>
           <w:color w:val="6B7280"/>
@@ -5409,7 +5537,7 @@
       </w:pPr>
       <w:r>
         <w:rPr>
-          <w:rFonts w:ascii="Inter" w:hAnsi="Inter"/>
+          <w:rFonts w:ascii="Lato" w:hAnsi="Lato"/>
           <w:b w:val="0"/>
           <w:i/>
           <w:color w:val="374151"/>
@@ -5428,7 +5556,7 @@
       </w:r>
       <w:r>
         <w:rPr>
-          <w:rFonts w:ascii="Inter" w:hAnsi="Inter"/>
+          <w:rFonts w:ascii="Lato" w:hAnsi="Lato"/>
           <w:b w:val="0"/>
           <w:i w:val="0"/>
           <w:color w:val="6B7280"/>
@@ -5444,7 +5572,7 @@
       </w:pPr>
       <w:r>
         <w:rPr>
-          <w:rFonts w:ascii="Inter" w:hAnsi="Inter"/>
+          <w:rFonts w:ascii="Lato" w:hAnsi="Lato"/>
           <w:b w:val="0"/>
           <w:i/>
           <w:color w:val="374151"/>
@@ -5454,7 +5582,7 @@
       </w:r>
       <w:r>
         <w:rPr>
-          <w:rFonts w:ascii="Inter" w:hAnsi="Inter"/>
+          <w:rFonts w:ascii="Lato" w:hAnsi="Lato"/>
           <w:b w:val="0"/>
           <w:i w:val="0"/>
           <w:color w:val="6B7280"/>
@@ -5478,7 +5606,7 @@
       </w:pPr>
       <w:r>
         <w:rPr>
-          <w:rFonts w:ascii="Inter" w:hAnsi="Inter"/>
+          <w:rFonts w:ascii="Lato" w:hAnsi="Lato"/>
           <w:b/>
           <w:color w:val="1E3A5F"/>
           <w:sz w:val="32"/>
@@ -5492,7 +5620,7 @@
       </w:pPr>
       <w:r>
         <w:rPr>
-          <w:rFonts w:ascii="Inter" w:hAnsi="Inter"/>
+          <w:rFonts w:ascii="Lato" w:hAnsi="Lato"/>
           <w:b w:val="0"/>
           <w:i w:val="0"/>
           <w:color w:val="6B7280"/>
@@ -5502,7 +5630,7 @@
       </w:r>
       <w:r>
         <w:rPr>
-          <w:rFonts w:ascii="Inter" w:hAnsi="Inter"/>
+          <w:rFonts w:ascii="Lato" w:hAnsi="Lato"/>
           <w:b w:val="0"/>
           <w:i w:val="0"/>
           <w:color w:val="374151"/>
@@ -5512,7 +5640,7 @@
       </w:r>
       <w:r>
         <w:rPr>
-          <w:rFonts w:ascii="Inter" w:hAnsi="Inter"/>
+          <w:rFonts w:ascii="Lato" w:hAnsi="Lato"/>
           <w:b/>
           <w:i w:val="0"/>
           <w:color w:val="059669"/>
@@ -5522,7 +5650,7 @@
       </w:r>
       <w:r>
         <w:rPr>
-          <w:rFonts w:ascii="Inter" w:hAnsi="Inter"/>
+          <w:rFonts w:ascii="Lato" w:hAnsi="Lato"/>
           <w:b w:val="0"/>
           <w:i w:val="0"/>
           <w:color w:val="374151"/>
@@ -5532,7 +5660,7 @@
       </w:r>
       <w:r>
         <w:rPr>
-          <w:rFonts w:ascii="Inter" w:hAnsi="Inter"/>
+          <w:rFonts w:ascii="Lato" w:hAnsi="Lato"/>
           <w:b/>
           <w:i w:val="0"/>
           <w:color w:val="374151"/>
@@ -5542,7 +5670,7 @@
       </w:r>
       <w:r>
         <w:rPr>
-          <w:rFonts w:ascii="Inter" w:hAnsi="Inter"/>
+          <w:rFonts w:ascii="Lato" w:hAnsi="Lato"/>
           <w:b w:val="0"/>
           <w:i w:val="0"/>
           <w:color w:val="6B7280"/>
@@ -5552,7 +5680,7 @@
       </w:r>
       <w:r>
         <w:rPr>
-          <w:rFonts w:ascii="Inter" w:hAnsi="Inter"/>
+          <w:rFonts w:ascii="Lato" w:hAnsi="Lato"/>
           <w:b w:val="0"/>
           <w:i w:val="0"/>
           <w:color w:val="6B7280"/>
@@ -5562,7 +5690,7 @@
       </w:r>
       <w:r>
         <w:rPr>
-          <w:rFonts w:ascii="Inter" w:hAnsi="Inter"/>
+          <w:rFonts w:ascii="Lato" w:hAnsi="Lato"/>
           <w:b/>
           <w:i w:val="0"/>
           <w:color w:val="059669"/>
@@ -5578,8 +5706,8 @@
       <w:r>
         <w:drawing>
           <wp:inline xmlns:a="http://schemas.openxmlformats.org/drawingml/2006/main" xmlns:pic="http://schemas.openxmlformats.org/drawingml/2006/picture">
-            <wp:extent cx="3474720" cy="3525078"/>
-            <wp:docPr id="12" name="Picture 12"/>
+            <wp:extent cx="3474720" cy="3547185"/>
+            <wp:docPr id="13" name="Picture 13"/>
             <wp:cNvGraphicFramePr>
               <a:graphicFrameLocks noChangeAspect="1"/>
             </wp:cNvGraphicFramePr>
@@ -5591,7 +5719,7 @@
                     <pic:cNvPicPr/>
                   </pic:nvPicPr>
                   <pic:blipFill>
-                    <a:blip r:embed="rId20"/>
+                    <a:blip r:embed="rId21"/>
                     <a:stretch>
                       <a:fillRect/>
                     </a:stretch>
@@ -5599,7 +5727,7 @@
                   <pic:spPr>
                     <a:xfrm>
                       <a:off x="0" y="0"/>
-                      <a:ext cx="3474720" cy="3525078"/>
+                      <a:ext cx="3474720" cy="3547185"/>
                     </a:xfrm>
                     <a:prstGeom prst="rect"/>
                   </pic:spPr>
@@ -5617,7 +5745,7 @@
       </w:pPr>
       <w:r>
         <w:rPr>
-          <w:rFonts w:ascii="Inter" w:hAnsi="Inter"/>
+          <w:rFonts w:ascii="Lato" w:hAnsi="Lato"/>
           <w:b w:val="0"/>
           <w:i/>
           <w:color w:val="6B7280"/>
@@ -5633,7 +5761,7 @@
       </w:pPr>
       <w:r>
         <w:rPr>
-          <w:rFonts w:ascii="Inter" w:hAnsi="Inter"/>
+          <w:rFonts w:ascii="Lato" w:hAnsi="Lato"/>
           <w:b/>
           <w:color w:val="1E3A5F"/>
           <w:sz w:val="26"/>
@@ -5647,7 +5775,7 @@
       </w:pPr>
       <w:r>
         <w:rPr>
-          <w:rFonts w:ascii="Inter" w:hAnsi="Inter"/>
+          <w:rFonts w:ascii="Lato" w:hAnsi="Lato"/>
           <w:b w:val="0"/>
           <w:i w:val="0"/>
           <w:sz w:val="22"/>
@@ -5662,7 +5790,7 @@
       </w:pPr>
       <w:r>
         <w:rPr>
-          <w:rFonts w:ascii="Inter" w:hAnsi="Inter"/>
+          <w:rFonts w:ascii="Lato" w:hAnsi="Lato"/>
           <w:b/>
           <w:color w:val="1E3A5F"/>
           <w:sz w:val="26"/>
@@ -5676,7 +5804,7 @@
       </w:pPr>
       <w:r>
         <w:rPr>
-          <w:rFonts w:ascii="Inter" w:hAnsi="Inter"/>
+          <w:rFonts w:ascii="Lato" w:hAnsi="Lato"/>
           <w:b w:val="0"/>
           <w:i w:val="0"/>
           <w:sz w:val="22"/>
@@ -5691,7 +5819,7 @@
       </w:pPr>
       <w:r>
         <w:rPr>
-          <w:rFonts w:ascii="Inter" w:hAnsi="Inter"/>
+          <w:rFonts w:ascii="Lato" w:hAnsi="Lato"/>
           <w:b/>
           <w:color w:val="1E3A5F"/>
           <w:sz w:val="26"/>
@@ -5705,7 +5833,7 @@
       </w:pPr>
       <w:r>
         <w:rPr>
-          <w:rFonts w:ascii="Inter" w:hAnsi="Inter"/>
+          <w:rFonts w:ascii="Lato" w:hAnsi="Lato"/>
           <w:b w:val="0"/>
           <w:i w:val="0"/>
           <w:sz w:val="22"/>
@@ -5720,7 +5848,7 @@
       </w:pPr>
       <w:r>
         <w:rPr>
-          <w:rFonts w:ascii="Inter" w:hAnsi="Inter"/>
+          <w:rFonts w:ascii="Lato" w:hAnsi="Lato"/>
           <w:b/>
           <w:color w:val="1E3A5F"/>
           <w:sz w:val="26"/>
@@ -5734,7 +5862,7 @@
       </w:pPr>
       <w:r>
         <w:rPr>
-          <w:rFonts w:ascii="Inter" w:hAnsi="Inter"/>
+          <w:rFonts w:ascii="Lato" w:hAnsi="Lato"/>
           <w:b w:val="0"/>
           <w:i w:val="0"/>
           <w:sz w:val="22"/>
@@ -5749,7 +5877,7 @@
       </w:pPr>
       <w:r>
         <w:rPr>
-          <w:rFonts w:ascii="Inter" w:hAnsi="Inter"/>
+          <w:rFonts w:ascii="Lato" w:hAnsi="Lato"/>
           <w:b/>
           <w:color w:val="1E3A5F"/>
           <w:sz w:val="26"/>
@@ -5763,7 +5891,7 @@
       </w:pPr>
       <w:r>
         <w:rPr>
-          <w:rFonts w:ascii="Inter" w:hAnsi="Inter"/>
+          <w:rFonts w:ascii="Lato" w:hAnsi="Lato"/>
           <w:b w:val="0"/>
           <w:i w:val="0"/>
           <w:sz w:val="22"/>
@@ -5778,7 +5906,7 @@
       </w:pPr>
       <w:r>
         <w:rPr>
-          <w:rFonts w:ascii="Inter" w:hAnsi="Inter"/>
+          <w:rFonts w:ascii="Lato" w:hAnsi="Lato"/>
           <w:b/>
           <w:color w:val="1E3A5F"/>
           <w:sz w:val="26"/>
@@ -5793,7 +5921,7 @@
       </w:pPr>
       <w:r>
         <w:rPr>
-          <w:rFonts w:ascii="Inter" w:hAnsi="Inter"/>
+          <w:rFonts w:ascii="Lato" w:hAnsi="Lato"/>
           <w:b w:val="0"/>
           <w:i/>
           <w:color w:val="374151"/>
@@ -5803,7 +5931,7 @@
       </w:r>
       <w:r>
         <w:rPr>
-          <w:rFonts w:ascii="Inter" w:hAnsi="Inter"/>
+          <w:rFonts w:ascii="Lato" w:hAnsi="Lato"/>
           <w:b w:val="0"/>
           <w:i w:val="0"/>
           <w:color w:val="6B7280"/>
@@ -5819,7 +5947,7 @@
       </w:pPr>
       <w:r>
         <w:rPr>
-          <w:rFonts w:ascii="Inter" w:hAnsi="Inter"/>
+          <w:rFonts w:ascii="Lato" w:hAnsi="Lato"/>
           <w:b w:val="0"/>
           <w:i/>
           <w:color w:val="374151"/>
@@ -5829,7 +5957,7 @@
       </w:r>
       <w:r>
         <w:rPr>
-          <w:rFonts w:ascii="Inter" w:hAnsi="Inter"/>
+          <w:rFonts w:ascii="Lato" w:hAnsi="Lato"/>
           <w:b w:val="0"/>
           <w:i w:val="0"/>
           <w:color w:val="6B7280"/>
@@ -5845,7 +5973,7 @@
       </w:pPr>
       <w:r>
         <w:rPr>
-          <w:rFonts w:ascii="Inter" w:hAnsi="Inter"/>
+          <w:rFonts w:ascii="Lato" w:hAnsi="Lato"/>
           <w:b w:val="0"/>
           <w:i/>
           <w:color w:val="374151"/>
@@ -5855,7 +5983,7 @@
       </w:r>
       <w:r>
         <w:rPr>
-          <w:rFonts w:ascii="Inter" w:hAnsi="Inter"/>
+          <w:rFonts w:ascii="Lato" w:hAnsi="Lato"/>
           <w:b w:val="0"/>
           <w:i w:val="0"/>
           <w:color w:val="6B7280"/>
@@ -5879,7 +6007,7 @@
       </w:pPr>
       <w:r>
         <w:rPr>
-          <w:rFonts w:ascii="Inter" w:hAnsi="Inter"/>
+          <w:rFonts w:ascii="Lato" w:hAnsi="Lato"/>
           <w:b/>
           <w:color w:val="1E3A5F"/>
           <w:sz w:val="32"/>
@@ -5893,7 +6021,7 @@
       </w:pPr>
       <w:r>
         <w:rPr>
-          <w:rFonts w:ascii="Inter" w:hAnsi="Inter"/>
+          <w:rFonts w:ascii="Lato" w:hAnsi="Lato"/>
           <w:b w:val="0"/>
           <w:i w:val="0"/>
           <w:color w:val="6B7280"/>
@@ -5903,7 +6031,7 @@
       </w:r>
       <w:r>
         <w:rPr>
-          <w:rFonts w:ascii="Inter" w:hAnsi="Inter"/>
+          <w:rFonts w:ascii="Lato" w:hAnsi="Lato"/>
           <w:b w:val="0"/>
           <w:i w:val="0"/>
           <w:color w:val="374151"/>
@@ -5913,7 +6041,7 @@
       </w:r>
       <w:r>
         <w:rPr>
-          <w:rFonts w:ascii="Inter" w:hAnsi="Inter"/>
+          <w:rFonts w:ascii="Lato" w:hAnsi="Lato"/>
           <w:b/>
           <w:i w:val="0"/>
           <w:color w:val="059669"/>
@@ -5923,7 +6051,7 @@
       </w:r>
       <w:r>
         <w:rPr>
-          <w:rFonts w:ascii="Inter" w:hAnsi="Inter"/>
+          <w:rFonts w:ascii="Lato" w:hAnsi="Lato"/>
           <w:b w:val="0"/>
           <w:i w:val="0"/>
           <w:color w:val="374151"/>
@@ -5933,7 +6061,7 @@
       </w:r>
       <w:r>
         <w:rPr>
-          <w:rFonts w:ascii="Inter" w:hAnsi="Inter"/>
+          <w:rFonts w:ascii="Lato" w:hAnsi="Lato"/>
           <w:b/>
           <w:i w:val="0"/>
           <w:color w:val="374151"/>
@@ -5943,7 +6071,7 @@
       </w:r>
       <w:r>
         <w:rPr>
-          <w:rFonts w:ascii="Inter" w:hAnsi="Inter"/>
+          <w:rFonts w:ascii="Lato" w:hAnsi="Lato"/>
           <w:b w:val="0"/>
           <w:i w:val="0"/>
           <w:color w:val="6B7280"/>
@@ -5953,7 +6081,7 @@
       </w:r>
       <w:r>
         <w:rPr>
-          <w:rFonts w:ascii="Inter" w:hAnsi="Inter"/>
+          <w:rFonts w:ascii="Lato" w:hAnsi="Lato"/>
           <w:b w:val="0"/>
           <w:i w:val="0"/>
           <w:color w:val="6B7280"/>
@@ -5963,7 +6091,7 @@
       </w:r>
       <w:r>
         <w:rPr>
-          <w:rFonts w:ascii="Inter" w:hAnsi="Inter"/>
+          <w:rFonts w:ascii="Lato" w:hAnsi="Lato"/>
           <w:b/>
           <w:i w:val="0"/>
           <w:color w:val="059669"/>
@@ -5979,8 +6107,8 @@
       <w:r>
         <w:drawing>
           <wp:inline xmlns:a="http://schemas.openxmlformats.org/drawingml/2006/main" xmlns:pic="http://schemas.openxmlformats.org/drawingml/2006/picture">
-            <wp:extent cx="3474720" cy="3525078"/>
-            <wp:docPr id="13" name="Picture 13"/>
+            <wp:extent cx="3474720" cy="3547185"/>
+            <wp:docPr id="14" name="Picture 14"/>
             <wp:cNvGraphicFramePr>
               <a:graphicFrameLocks noChangeAspect="1"/>
             </wp:cNvGraphicFramePr>
@@ -5992,7 +6120,7 @@
                     <pic:cNvPicPr/>
                   </pic:nvPicPr>
                   <pic:blipFill>
-                    <a:blip r:embed="rId21"/>
+                    <a:blip r:embed="rId22"/>
                     <a:stretch>
                       <a:fillRect/>
                     </a:stretch>
@@ -6000,7 +6128,7 @@
                   <pic:spPr>
                     <a:xfrm>
                       <a:off x="0" y="0"/>
-                      <a:ext cx="3474720" cy="3525078"/>
+                      <a:ext cx="3474720" cy="3547185"/>
                     </a:xfrm>
                     <a:prstGeom prst="rect"/>
                   </pic:spPr>
@@ -6018,7 +6146,7 @@
       </w:pPr>
       <w:r>
         <w:rPr>
-          <w:rFonts w:ascii="Inter" w:hAnsi="Inter"/>
+          <w:rFonts w:ascii="Lato" w:hAnsi="Lato"/>
           <w:b w:val="0"/>
           <w:i/>
           <w:color w:val="6B7280"/>
@@ -6034,7 +6162,7 @@
       </w:pPr>
       <w:r>
         <w:rPr>
-          <w:rFonts w:ascii="Inter" w:hAnsi="Inter"/>
+          <w:rFonts w:ascii="Lato" w:hAnsi="Lato"/>
           <w:b/>
           <w:color w:val="1E3A5F"/>
           <w:sz w:val="26"/>
@@ -6048,7 +6176,7 @@
       </w:pPr>
       <w:r>
         <w:rPr>
-          <w:rFonts w:ascii="Inter" w:hAnsi="Inter"/>
+          <w:rFonts w:ascii="Lato" w:hAnsi="Lato"/>
           <w:b w:val="0"/>
           <w:i w:val="0"/>
           <w:sz w:val="22"/>
@@ -6063,7 +6191,7 @@
       </w:pPr>
       <w:r>
         <w:rPr>
-          <w:rFonts w:ascii="Inter" w:hAnsi="Inter"/>
+          <w:rFonts w:ascii="Lato" w:hAnsi="Lato"/>
           <w:b/>
           <w:color w:val="1E3A5F"/>
           <w:sz w:val="26"/>
@@ -6077,7 +6205,7 @@
       </w:pPr>
       <w:r>
         <w:rPr>
-          <w:rFonts w:ascii="Inter" w:hAnsi="Inter"/>
+          <w:rFonts w:ascii="Lato" w:hAnsi="Lato"/>
           <w:b w:val="0"/>
           <w:i w:val="0"/>
           <w:sz w:val="22"/>
@@ -6092,7 +6220,7 @@
       </w:pPr>
       <w:r>
         <w:rPr>
-          <w:rFonts w:ascii="Inter" w:hAnsi="Inter"/>
+          <w:rFonts w:ascii="Lato" w:hAnsi="Lato"/>
           <w:b/>
           <w:color w:val="1E3A5F"/>
           <w:sz w:val="26"/>
@@ -6106,7 +6234,7 @@
       </w:pPr>
       <w:r>
         <w:rPr>
-          <w:rFonts w:ascii="Inter" w:hAnsi="Inter"/>
+          <w:rFonts w:ascii="Lato" w:hAnsi="Lato"/>
           <w:b w:val="0"/>
           <w:i w:val="0"/>
           <w:sz w:val="22"/>
@@ -6121,7 +6249,7 @@
       </w:pPr>
       <w:r>
         <w:rPr>
-          <w:rFonts w:ascii="Inter" w:hAnsi="Inter"/>
+          <w:rFonts w:ascii="Lato" w:hAnsi="Lato"/>
           <w:b/>
           <w:color w:val="1E3A5F"/>
           <w:sz w:val="26"/>
@@ -6135,7 +6263,7 @@
       </w:pPr>
       <w:r>
         <w:rPr>
-          <w:rFonts w:ascii="Inter" w:hAnsi="Inter"/>
+          <w:rFonts w:ascii="Lato" w:hAnsi="Lato"/>
           <w:b w:val="0"/>
           <w:i w:val="0"/>
           <w:sz w:val="22"/>
@@ -6150,7 +6278,7 @@
       </w:pPr>
       <w:r>
         <w:rPr>
-          <w:rFonts w:ascii="Inter" w:hAnsi="Inter"/>
+          <w:rFonts w:ascii="Lato" w:hAnsi="Lato"/>
           <w:b/>
           <w:color w:val="1E3A5F"/>
           <w:sz w:val="26"/>
@@ -6164,7 +6292,7 @@
       </w:pPr>
       <w:r>
         <w:rPr>
-          <w:rFonts w:ascii="Inter" w:hAnsi="Inter"/>
+          <w:rFonts w:ascii="Lato" w:hAnsi="Lato"/>
           <w:b w:val="0"/>
           <w:i w:val="0"/>
           <w:sz w:val="22"/>
@@ -6179,7 +6307,7 @@
       </w:pPr>
       <w:r>
         <w:rPr>
-          <w:rFonts w:ascii="Inter" w:hAnsi="Inter"/>
+          <w:rFonts w:ascii="Lato" w:hAnsi="Lato"/>
           <w:b/>
           <w:color w:val="1E3A5F"/>
           <w:sz w:val="26"/>
@@ -6194,7 +6322,7 @@
       </w:pPr>
       <w:r>
         <w:rPr>
-          <w:rFonts w:ascii="Inter" w:hAnsi="Inter"/>
+          <w:rFonts w:ascii="Lato" w:hAnsi="Lato"/>
           <w:b w:val="0"/>
           <w:i/>
           <w:color w:val="374151"/>
@@ -6204,7 +6332,7 @@
       </w:r>
       <w:r>
         <w:rPr>
-          <w:rFonts w:ascii="Inter" w:hAnsi="Inter"/>
+          <w:rFonts w:ascii="Lato" w:hAnsi="Lato"/>
           <w:b w:val="0"/>
           <w:i w:val="0"/>
           <w:color w:val="6B7280"/>
@@ -6220,7 +6348,7 @@
       </w:pPr>
       <w:r>
         <w:rPr>
-          <w:rFonts w:ascii="Inter" w:hAnsi="Inter"/>
+          <w:rFonts w:ascii="Lato" w:hAnsi="Lato"/>
           <w:b w:val="0"/>
           <w:i/>
           <w:color w:val="374151"/>
@@ -6230,7 +6358,7 @@
       </w:r>
       <w:r>
         <w:rPr>
-          <w:rFonts w:ascii="Inter" w:hAnsi="Inter"/>
+          <w:rFonts w:ascii="Lato" w:hAnsi="Lato"/>
           <w:b w:val="0"/>
           <w:i w:val="0"/>
           <w:color w:val="6B7280"/>
@@ -6246,7 +6374,7 @@
       </w:pPr>
       <w:r>
         <w:rPr>
-          <w:rFonts w:ascii="Inter" w:hAnsi="Inter"/>
+          <w:rFonts w:ascii="Lato" w:hAnsi="Lato"/>
           <w:b w:val="0"/>
           <w:i/>
           <w:color w:val="374151"/>
@@ -6256,7 +6384,7 @@
       </w:r>
       <w:r>
         <w:rPr>
-          <w:rFonts w:ascii="Inter" w:hAnsi="Inter"/>
+          <w:rFonts w:ascii="Lato" w:hAnsi="Lato"/>
           <w:b w:val="0"/>
           <w:i w:val="0"/>
           <w:color w:val="6B7280"/>
@@ -6280,7 +6408,7 @@
       </w:pPr>
       <w:r>
         <w:rPr>
-          <w:rFonts w:ascii="Inter" w:hAnsi="Inter"/>
+          <w:rFonts w:ascii="Lato" w:hAnsi="Lato"/>
           <w:b/>
           <w:color w:val="1E3A5F"/>
           <w:sz w:val="32"/>
@@ -6294,7 +6422,7 @@
       </w:pPr>
       <w:r>
         <w:rPr>
-          <w:rFonts w:ascii="Inter" w:hAnsi="Inter"/>
+          <w:rFonts w:ascii="Lato" w:hAnsi="Lato"/>
           <w:b w:val="0"/>
           <w:i w:val="0"/>
           <w:color w:val="6B7280"/>
@@ -6304,7 +6432,7 @@
       </w:r>
       <w:r>
         <w:rPr>
-          <w:rFonts w:ascii="Inter" w:hAnsi="Inter"/>
+          <w:rFonts w:ascii="Lato" w:hAnsi="Lato"/>
           <w:b w:val="0"/>
           <w:i w:val="0"/>
           <w:color w:val="374151"/>
@@ -6314,7 +6442,7 @@
       </w:r>
       <w:r>
         <w:rPr>
-          <w:rFonts w:ascii="Inter" w:hAnsi="Inter"/>
+          <w:rFonts w:ascii="Lato" w:hAnsi="Lato"/>
           <w:b/>
           <w:i w:val="0"/>
           <w:color w:val="059669"/>
@@ -6324,7 +6452,7 @@
       </w:r>
       <w:r>
         <w:rPr>
-          <w:rFonts w:ascii="Inter" w:hAnsi="Inter"/>
+          <w:rFonts w:ascii="Lato" w:hAnsi="Lato"/>
           <w:b w:val="0"/>
           <w:i w:val="0"/>
           <w:color w:val="374151"/>
@@ -6334,7 +6462,7 @@
       </w:r>
       <w:r>
         <w:rPr>
-          <w:rFonts w:ascii="Inter" w:hAnsi="Inter"/>
+          <w:rFonts w:ascii="Lato" w:hAnsi="Lato"/>
           <w:b/>
           <w:i w:val="0"/>
           <w:color w:val="374151"/>
@@ -6344,7 +6472,7 @@
       </w:r>
       <w:r>
         <w:rPr>
-          <w:rFonts w:ascii="Inter" w:hAnsi="Inter"/>
+          <w:rFonts w:ascii="Lato" w:hAnsi="Lato"/>
           <w:b w:val="0"/>
           <w:i w:val="0"/>
           <w:color w:val="6B7280"/>
@@ -6354,7 +6482,7 @@
       </w:r>
       <w:r>
         <w:rPr>
-          <w:rFonts w:ascii="Inter" w:hAnsi="Inter"/>
+          <w:rFonts w:ascii="Lato" w:hAnsi="Lato"/>
           <w:b w:val="0"/>
           <w:i w:val="0"/>
           <w:color w:val="6B7280"/>
@@ -6364,7 +6492,7 @@
       </w:r>
       <w:r>
         <w:rPr>
-          <w:rFonts w:ascii="Inter" w:hAnsi="Inter"/>
+          <w:rFonts w:ascii="Lato" w:hAnsi="Lato"/>
           <w:b/>
           <w:i w:val="0"/>
           <w:color w:val="059669"/>
@@ -6380,8 +6508,8 @@
       <w:r>
         <w:drawing>
           <wp:inline xmlns:a="http://schemas.openxmlformats.org/drawingml/2006/main" xmlns:pic="http://schemas.openxmlformats.org/drawingml/2006/picture">
-            <wp:extent cx="3474720" cy="3525078"/>
-            <wp:docPr id="14" name="Picture 14"/>
+            <wp:extent cx="3474720" cy="3547185"/>
+            <wp:docPr id="15" name="Picture 15"/>
             <wp:cNvGraphicFramePr>
               <a:graphicFrameLocks noChangeAspect="1"/>
             </wp:cNvGraphicFramePr>
@@ -6393,7 +6521,7 @@
                     <pic:cNvPicPr/>
                   </pic:nvPicPr>
                   <pic:blipFill>
-                    <a:blip r:embed="rId22"/>
+                    <a:blip r:embed="rId23"/>
                     <a:stretch>
                       <a:fillRect/>
                     </a:stretch>
@@ -6401,7 +6529,7 @@
                   <pic:spPr>
                     <a:xfrm>
                       <a:off x="0" y="0"/>
-                      <a:ext cx="3474720" cy="3525078"/>
+                      <a:ext cx="3474720" cy="3547185"/>
                     </a:xfrm>
                     <a:prstGeom prst="rect"/>
                   </pic:spPr>
@@ -6419,7 +6547,7 @@
       </w:pPr>
       <w:r>
         <w:rPr>
-          <w:rFonts w:ascii="Inter" w:hAnsi="Inter"/>
+          <w:rFonts w:ascii="Lato" w:hAnsi="Lato"/>
           <w:b w:val="0"/>
           <w:i/>
           <w:color w:val="6B7280"/>
@@ -6435,7 +6563,7 @@
       </w:pPr>
       <w:r>
         <w:rPr>
-          <w:rFonts w:ascii="Inter" w:hAnsi="Inter"/>
+          <w:rFonts w:ascii="Lato" w:hAnsi="Lato"/>
           <w:b/>
           <w:color w:val="1E3A5F"/>
           <w:sz w:val="26"/>
@@ -6449,7 +6577,7 @@
       </w:pPr>
       <w:r>
         <w:rPr>
-          <w:rFonts w:ascii="Inter" w:hAnsi="Inter"/>
+          <w:rFonts w:ascii="Lato" w:hAnsi="Lato"/>
           <w:b w:val="0"/>
           <w:i w:val="0"/>
           <w:sz w:val="22"/>
@@ -6464,7 +6592,7 @@
       </w:pPr>
       <w:r>
         <w:rPr>
-          <w:rFonts w:ascii="Inter" w:hAnsi="Inter"/>
+          <w:rFonts w:ascii="Lato" w:hAnsi="Lato"/>
           <w:b/>
           <w:color w:val="1E3A5F"/>
           <w:sz w:val="26"/>
@@ -6478,7 +6606,7 @@
       </w:pPr>
       <w:r>
         <w:rPr>
-          <w:rFonts w:ascii="Inter" w:hAnsi="Inter"/>
+          <w:rFonts w:ascii="Lato" w:hAnsi="Lato"/>
           <w:b w:val="0"/>
           <w:i w:val="0"/>
           <w:sz w:val="22"/>
@@ -6493,7 +6621,7 @@
       </w:pPr>
       <w:r>
         <w:rPr>
-          <w:rFonts w:ascii="Inter" w:hAnsi="Inter"/>
+          <w:rFonts w:ascii="Lato" w:hAnsi="Lato"/>
           <w:b/>
           <w:color w:val="1E3A5F"/>
           <w:sz w:val="26"/>
@@ -6507,7 +6635,7 @@
       </w:pPr>
       <w:r>
         <w:rPr>
-          <w:rFonts w:ascii="Inter" w:hAnsi="Inter"/>
+          <w:rFonts w:ascii="Lato" w:hAnsi="Lato"/>
           <w:b w:val="0"/>
           <w:i w:val="0"/>
           <w:sz w:val="22"/>
@@ -6522,7 +6650,7 @@
       </w:pPr>
       <w:r>
         <w:rPr>
-          <w:rFonts w:ascii="Inter" w:hAnsi="Inter"/>
+          <w:rFonts w:ascii="Lato" w:hAnsi="Lato"/>
           <w:b/>
           <w:color w:val="1E3A5F"/>
           <w:sz w:val="26"/>
@@ -6536,7 +6664,7 @@
       </w:pPr>
       <w:r>
         <w:rPr>
-          <w:rFonts w:ascii="Inter" w:hAnsi="Inter"/>
+          <w:rFonts w:ascii="Lato" w:hAnsi="Lato"/>
           <w:b w:val="0"/>
           <w:i w:val="0"/>
           <w:sz w:val="22"/>
@@ -6551,7 +6679,7 @@
       </w:pPr>
       <w:r>
         <w:rPr>
-          <w:rFonts w:ascii="Inter" w:hAnsi="Inter"/>
+          <w:rFonts w:ascii="Lato" w:hAnsi="Lato"/>
           <w:b/>
           <w:color w:val="1E3A5F"/>
           <w:sz w:val="26"/>
@@ -6565,7 +6693,7 @@
       </w:pPr>
       <w:r>
         <w:rPr>
-          <w:rFonts w:ascii="Inter" w:hAnsi="Inter"/>
+          <w:rFonts w:ascii="Lato" w:hAnsi="Lato"/>
           <w:b w:val="0"/>
           <w:i w:val="0"/>
           <w:sz w:val="22"/>
@@ -6580,7 +6708,7 @@
       </w:pPr>
       <w:r>
         <w:rPr>
-          <w:rFonts w:ascii="Inter" w:hAnsi="Inter"/>
+          <w:rFonts w:ascii="Lato" w:hAnsi="Lato"/>
           <w:b/>
           <w:color w:val="1E3A5F"/>
           <w:sz w:val="26"/>
@@ -6595,7 +6723,7 @@
       </w:pPr>
       <w:r>
         <w:rPr>
-          <w:rFonts w:ascii="Inter" w:hAnsi="Inter"/>
+          <w:rFonts w:ascii="Lato" w:hAnsi="Lato"/>
           <w:b w:val="0"/>
           <w:i/>
           <w:color w:val="374151"/>
@@ -6605,7 +6733,7 @@
       </w:r>
       <w:r>
         <w:rPr>
-          <w:rFonts w:ascii="Inter" w:hAnsi="Inter"/>
+          <w:rFonts w:ascii="Lato" w:hAnsi="Lato"/>
           <w:b w:val="0"/>
           <w:i w:val="0"/>
           <w:color w:val="6B7280"/>
@@ -6621,7 +6749,7 @@
       </w:pPr>
       <w:r>
         <w:rPr>
-          <w:rFonts w:ascii="Inter" w:hAnsi="Inter"/>
+          <w:rFonts w:ascii="Lato" w:hAnsi="Lato"/>
           <w:b w:val="0"/>
           <w:i/>
           <w:color w:val="374151"/>
@@ -6631,7 +6759,7 @@
       </w:r>
       <w:r>
         <w:rPr>
-          <w:rFonts w:ascii="Inter" w:hAnsi="Inter"/>
+          <w:rFonts w:ascii="Lato" w:hAnsi="Lato"/>
           <w:b w:val="0"/>
           <w:i w:val="0"/>
           <w:color w:val="6B7280"/>
@@ -6647,7 +6775,7 @@
       </w:pPr>
       <w:r>
         <w:rPr>
-          <w:rFonts w:ascii="Inter" w:hAnsi="Inter"/>
+          <w:rFonts w:ascii="Lato" w:hAnsi="Lato"/>
           <w:b w:val="0"/>
           <w:i/>
           <w:color w:val="374151"/>
@@ -6667,7 +6795,7 @@
       </w:r>
       <w:r>
         <w:rPr>
-          <w:rFonts w:ascii="Inter" w:hAnsi="Inter"/>
+          <w:rFonts w:ascii="Lato" w:hAnsi="Lato"/>
           <w:b w:val="0"/>
           <w:i w:val="0"/>
           <w:color w:val="6B7280"/>
@@ -6691,7 +6819,7 @@
       </w:pPr>
       <w:r>
         <w:rPr>
-          <w:rFonts w:ascii="Inter" w:hAnsi="Inter"/>
+          <w:rFonts w:ascii="Lato" w:hAnsi="Lato"/>
           <w:b/>
           <w:color w:val="1E3A5F"/>
           <w:sz w:val="32"/>
@@ -6705,7 +6833,7 @@
       </w:pPr>
       <w:r>
         <w:rPr>
-          <w:rFonts w:ascii="Inter" w:hAnsi="Inter"/>
+          <w:rFonts w:ascii="Lato" w:hAnsi="Lato"/>
           <w:b w:val="0"/>
           <w:i w:val="0"/>
           <w:color w:val="6B7280"/>
@@ -6715,7 +6843,7 @@
       </w:r>
       <w:r>
         <w:rPr>
-          <w:rFonts w:ascii="Inter" w:hAnsi="Inter"/>
+          <w:rFonts w:ascii="Lato" w:hAnsi="Lato"/>
           <w:b w:val="0"/>
           <w:i w:val="0"/>
           <w:color w:val="374151"/>
@@ -6725,7 +6853,7 @@
       </w:r>
       <w:r>
         <w:rPr>
-          <w:rFonts w:ascii="Inter" w:hAnsi="Inter"/>
+          <w:rFonts w:ascii="Lato" w:hAnsi="Lato"/>
           <w:b/>
           <w:i w:val="0"/>
           <w:color w:val="059669"/>
@@ -6735,7 +6863,7 @@
       </w:r>
       <w:r>
         <w:rPr>
-          <w:rFonts w:ascii="Inter" w:hAnsi="Inter"/>
+          <w:rFonts w:ascii="Lato" w:hAnsi="Lato"/>
           <w:b w:val="0"/>
           <w:i w:val="0"/>
           <w:color w:val="374151"/>
@@ -6745,7 +6873,7 @@
       </w:r>
       <w:r>
         <w:rPr>
-          <w:rFonts w:ascii="Inter" w:hAnsi="Inter"/>
+          <w:rFonts w:ascii="Lato" w:hAnsi="Lato"/>
           <w:b/>
           <w:i w:val="0"/>
           <w:color w:val="374151"/>
@@ -6755,7 +6883,7 @@
       </w:r>
       <w:r>
         <w:rPr>
-          <w:rFonts w:ascii="Inter" w:hAnsi="Inter"/>
+          <w:rFonts w:ascii="Lato" w:hAnsi="Lato"/>
           <w:b w:val="0"/>
           <w:i w:val="0"/>
           <w:color w:val="6B7280"/>
@@ -6765,7 +6893,7 @@
       </w:r>
       <w:r>
         <w:rPr>
-          <w:rFonts w:ascii="Inter" w:hAnsi="Inter"/>
+          <w:rFonts w:ascii="Lato" w:hAnsi="Lato"/>
           <w:b w:val="0"/>
           <w:i w:val="0"/>
           <w:color w:val="6B7280"/>
@@ -6775,7 +6903,7 @@
       </w:r>
       <w:r>
         <w:rPr>
-          <w:rFonts w:ascii="Inter" w:hAnsi="Inter"/>
+          <w:rFonts w:ascii="Lato" w:hAnsi="Lato"/>
           <w:b/>
           <w:i w:val="0"/>
           <w:color w:val="DC2626"/>
@@ -6791,8 +6919,8 @@
       <w:r>
         <w:drawing>
           <wp:inline xmlns:a="http://schemas.openxmlformats.org/drawingml/2006/main" xmlns:pic="http://schemas.openxmlformats.org/drawingml/2006/picture">
-            <wp:extent cx="3474720" cy="3525078"/>
-            <wp:docPr id="15" name="Picture 15"/>
+            <wp:extent cx="3474720" cy="3547185"/>
+            <wp:docPr id="16" name="Picture 16"/>
             <wp:cNvGraphicFramePr>
               <a:graphicFrameLocks noChangeAspect="1"/>
             </wp:cNvGraphicFramePr>
@@ -6804,7 +6932,7 @@
                     <pic:cNvPicPr/>
                   </pic:nvPicPr>
                   <pic:blipFill>
-                    <a:blip r:embed="rId23"/>
+                    <a:blip r:embed="rId24"/>
                     <a:stretch>
                       <a:fillRect/>
                     </a:stretch>
@@ -6812,7 +6940,7 @@
                   <pic:spPr>
                     <a:xfrm>
                       <a:off x="0" y="0"/>
-                      <a:ext cx="3474720" cy="3525078"/>
+                      <a:ext cx="3474720" cy="3547185"/>
                     </a:xfrm>
                     <a:prstGeom prst="rect"/>
                   </pic:spPr>
@@ -6830,7 +6958,7 @@
       </w:pPr>
       <w:r>
         <w:rPr>
-          <w:rFonts w:ascii="Inter" w:hAnsi="Inter"/>
+          <w:rFonts w:ascii="Lato" w:hAnsi="Lato"/>
           <w:b w:val="0"/>
           <w:i/>
           <w:color w:val="6B7280"/>
@@ -6846,7 +6974,7 @@
       </w:pPr>
       <w:r>
         <w:rPr>
-          <w:rFonts w:ascii="Inter" w:hAnsi="Inter"/>
+          <w:rFonts w:ascii="Lato" w:hAnsi="Lato"/>
           <w:b/>
           <w:color w:val="1E3A5F"/>
           <w:sz w:val="26"/>
@@ -6860,7 +6988,7 @@
       </w:pPr>
       <w:r>
         <w:rPr>
-          <w:rFonts w:ascii="Inter" w:hAnsi="Inter"/>
+          <w:rFonts w:ascii="Lato" w:hAnsi="Lato"/>
           <w:b w:val="0"/>
           <w:i w:val="0"/>
           <w:sz w:val="22"/>
@@ -6875,7 +7003,7 @@
       </w:pPr>
       <w:r>
         <w:rPr>
-          <w:rFonts w:ascii="Inter" w:hAnsi="Inter"/>
+          <w:rFonts w:ascii="Lato" w:hAnsi="Lato"/>
           <w:b/>
           <w:color w:val="1E3A5F"/>
           <w:sz w:val="26"/>
@@ -6889,7 +7017,7 @@
       </w:pPr>
       <w:r>
         <w:rPr>
-          <w:rFonts w:ascii="Inter" w:hAnsi="Inter"/>
+          <w:rFonts w:ascii="Lato" w:hAnsi="Lato"/>
           <w:b w:val="0"/>
           <w:i w:val="0"/>
           <w:sz w:val="22"/>
@@ -6904,7 +7032,7 @@
       </w:pPr>
       <w:r>
         <w:rPr>
-          <w:rFonts w:ascii="Inter" w:hAnsi="Inter"/>
+          <w:rFonts w:ascii="Lato" w:hAnsi="Lato"/>
           <w:b/>
           <w:color w:val="1E3A5F"/>
           <w:sz w:val="26"/>
@@ -6918,7 +7046,7 @@
       </w:pPr>
       <w:r>
         <w:rPr>
-          <w:rFonts w:ascii="Inter" w:hAnsi="Inter"/>
+          <w:rFonts w:ascii="Lato" w:hAnsi="Lato"/>
           <w:b w:val="0"/>
           <w:i w:val="0"/>
           <w:sz w:val="22"/>
@@ -6933,7 +7061,7 @@
       </w:pPr>
       <w:r>
         <w:rPr>
-          <w:rFonts w:ascii="Inter" w:hAnsi="Inter"/>
+          <w:rFonts w:ascii="Lato" w:hAnsi="Lato"/>
           <w:b/>
           <w:color w:val="1E3A5F"/>
           <w:sz w:val="26"/>
@@ -6947,7 +7075,7 @@
       </w:pPr>
       <w:r>
         <w:rPr>
-          <w:rFonts w:ascii="Inter" w:hAnsi="Inter"/>
+          <w:rFonts w:ascii="Lato" w:hAnsi="Lato"/>
           <w:b w:val="0"/>
           <w:i w:val="0"/>
           <w:sz w:val="22"/>
@@ -6962,7 +7090,7 @@
       </w:pPr>
       <w:r>
         <w:rPr>
-          <w:rFonts w:ascii="Inter" w:hAnsi="Inter"/>
+          <w:rFonts w:ascii="Lato" w:hAnsi="Lato"/>
           <w:b/>
           <w:color w:val="1E3A5F"/>
           <w:sz w:val="26"/>
@@ -6976,7 +7104,7 @@
       </w:pPr>
       <w:r>
         <w:rPr>
-          <w:rFonts w:ascii="Inter" w:hAnsi="Inter"/>
+          <w:rFonts w:ascii="Lato" w:hAnsi="Lato"/>
           <w:b w:val="0"/>
           <w:i w:val="0"/>
           <w:sz w:val="22"/>
@@ -6991,7 +7119,7 @@
       </w:pPr>
       <w:r>
         <w:rPr>
-          <w:rFonts w:ascii="Inter" w:hAnsi="Inter"/>
+          <w:rFonts w:ascii="Lato" w:hAnsi="Lato"/>
           <w:b/>
           <w:color w:val="1E3A5F"/>
           <w:sz w:val="26"/>
@@ -7006,7 +7134,7 @@
       </w:pPr>
       <w:r>
         <w:rPr>
-          <w:rFonts w:ascii="Inter" w:hAnsi="Inter"/>
+          <w:rFonts w:ascii="Lato" w:hAnsi="Lato"/>
           <w:b w:val="0"/>
           <w:i/>
           <w:color w:val="374151"/>
@@ -7019,7 +7147,7 @@
       </w:r>
       <w:r>
         <w:rPr>
-          <w:rFonts w:ascii="Inter" w:hAnsi="Inter"/>
+          <w:rFonts w:ascii="Lato" w:hAnsi="Lato"/>
           <w:b w:val="0"/>
           <w:i w:val="0"/>
           <w:color w:val="6B7280"/>
@@ -7035,7 +7163,7 @@
       </w:pPr>
       <w:r>
         <w:rPr>
-          <w:rFonts w:ascii="Inter" w:hAnsi="Inter"/>
+          <w:rFonts w:ascii="Lato" w:hAnsi="Lato"/>
           <w:b w:val="0"/>
           <w:i/>
           <w:color w:val="374151"/>
@@ -7045,7 +7173,7 @@
       </w:r>
       <w:r>
         <w:rPr>
-          <w:rFonts w:ascii="Inter" w:hAnsi="Inter"/>
+          <w:rFonts w:ascii="Lato" w:hAnsi="Lato"/>
           <w:b w:val="0"/>
           <w:i w:val="0"/>
           <w:color w:val="6B7280"/>
@@ -7061,7 +7189,7 @@
       </w:pPr>
       <w:r>
         <w:rPr>
-          <w:rFonts w:ascii="Inter" w:hAnsi="Inter"/>
+          <w:rFonts w:ascii="Lato" w:hAnsi="Lato"/>
           <w:b w:val="0"/>
           <w:i/>
           <w:color w:val="374151"/>
@@ -7071,7 +7199,7 @@
       </w:r>
       <w:r>
         <w:rPr>
-          <w:rFonts w:ascii="Inter" w:hAnsi="Inter"/>
+          <w:rFonts w:ascii="Lato" w:hAnsi="Lato"/>
           <w:b w:val="0"/>
           <w:i w:val="0"/>
           <w:color w:val="6B7280"/>
@@ -7095,7 +7223,7 @@
       </w:pPr>
       <w:r>
         <w:rPr>
-          <w:rFonts w:ascii="Inter" w:hAnsi="Inter"/>
+          <w:rFonts w:ascii="Lato" w:hAnsi="Lato"/>
           <w:b/>
           <w:color w:val="1E3A5F"/>
           <w:sz w:val="32"/>
@@ -7109,7 +7237,7 @@
       </w:pPr>
       <w:r>
         <w:rPr>
-          <w:rFonts w:ascii="Inter" w:hAnsi="Inter"/>
+          <w:rFonts w:ascii="Lato" w:hAnsi="Lato"/>
           <w:b w:val="0"/>
           <w:i w:val="0"/>
           <w:color w:val="6B7280"/>
@@ -7119,7 +7247,7 @@
       </w:r>
       <w:r>
         <w:rPr>
-          <w:rFonts w:ascii="Inter" w:hAnsi="Inter"/>
+          <w:rFonts w:ascii="Lato" w:hAnsi="Lato"/>
           <w:b w:val="0"/>
           <w:i w:val="0"/>
           <w:color w:val="374151"/>
@@ -7129,7 +7257,7 @@
       </w:r>
       <w:r>
         <w:rPr>
-          <w:rFonts w:ascii="Inter" w:hAnsi="Inter"/>
+          <w:rFonts w:ascii="Lato" w:hAnsi="Lato"/>
           <w:b/>
           <w:i w:val="0"/>
           <w:color w:val="059669"/>
@@ -7139,7 +7267,7 @@
       </w:r>
       <w:r>
         <w:rPr>
-          <w:rFonts w:ascii="Inter" w:hAnsi="Inter"/>
+          <w:rFonts w:ascii="Lato" w:hAnsi="Lato"/>
           <w:b w:val="0"/>
           <w:i w:val="0"/>
           <w:color w:val="374151"/>
@@ -7149,7 +7277,7 @@
       </w:r>
       <w:r>
         <w:rPr>
-          <w:rFonts w:ascii="Inter" w:hAnsi="Inter"/>
+          <w:rFonts w:ascii="Lato" w:hAnsi="Lato"/>
           <w:b/>
           <w:i w:val="0"/>
           <w:color w:val="374151"/>
@@ -7159,7 +7287,7 @@
       </w:r>
       <w:r>
         <w:rPr>
-          <w:rFonts w:ascii="Inter" w:hAnsi="Inter"/>
+          <w:rFonts w:ascii="Lato" w:hAnsi="Lato"/>
           <w:b w:val="0"/>
           <w:i w:val="0"/>
           <w:color w:val="6B7280"/>
@@ -7169,7 +7297,7 @@
       </w:r>
       <w:r>
         <w:rPr>
-          <w:rFonts w:ascii="Inter" w:hAnsi="Inter"/>
+          <w:rFonts w:ascii="Lato" w:hAnsi="Lato"/>
           <w:b w:val="0"/>
           <w:i w:val="0"/>
           <w:color w:val="6B7280"/>
@@ -7179,7 +7307,7 @@
       </w:r>
       <w:r>
         <w:rPr>
-          <w:rFonts w:ascii="Inter" w:hAnsi="Inter"/>
+          <w:rFonts w:ascii="Lato" w:hAnsi="Lato"/>
           <w:b/>
           <w:i w:val="0"/>
           <w:color w:val="059669"/>
@@ -7195,8 +7323,8 @@
       <w:r>
         <w:drawing>
           <wp:inline xmlns:a="http://schemas.openxmlformats.org/drawingml/2006/main" xmlns:pic="http://schemas.openxmlformats.org/drawingml/2006/picture">
-            <wp:extent cx="3474720" cy="3525078"/>
-            <wp:docPr id="16" name="Picture 16"/>
+            <wp:extent cx="3474720" cy="3547185"/>
+            <wp:docPr id="17" name="Picture 17"/>
             <wp:cNvGraphicFramePr>
               <a:graphicFrameLocks noChangeAspect="1"/>
             </wp:cNvGraphicFramePr>
@@ -7208,7 +7336,7 @@
                     <pic:cNvPicPr/>
                   </pic:nvPicPr>
                   <pic:blipFill>
-                    <a:blip r:embed="rId24"/>
+                    <a:blip r:embed="rId25"/>
                     <a:stretch>
                       <a:fillRect/>
                     </a:stretch>
@@ -7216,7 +7344,7 @@
                   <pic:spPr>
                     <a:xfrm>
                       <a:off x="0" y="0"/>
-                      <a:ext cx="3474720" cy="3525078"/>
+                      <a:ext cx="3474720" cy="3547185"/>
                     </a:xfrm>
                     <a:prstGeom prst="rect"/>
                   </pic:spPr>
@@ -7234,7 +7362,7 @@
       </w:pPr>
       <w:r>
         <w:rPr>
-          <w:rFonts w:ascii="Inter" w:hAnsi="Inter"/>
+          <w:rFonts w:ascii="Lato" w:hAnsi="Lato"/>
           <w:b w:val="0"/>
           <w:i/>
           <w:color w:val="6B7280"/>
@@ -7250,7 +7378,7 @@
       </w:pPr>
       <w:r>
         <w:rPr>
-          <w:rFonts w:ascii="Inter" w:hAnsi="Inter"/>
+          <w:rFonts w:ascii="Lato" w:hAnsi="Lato"/>
           <w:b/>
           <w:color w:val="1E3A5F"/>
           <w:sz w:val="26"/>
@@ -7264,7 +7392,7 @@
       </w:pPr>
       <w:r>
         <w:rPr>
-          <w:rFonts w:ascii="Inter" w:hAnsi="Inter"/>
+          <w:rFonts w:ascii="Lato" w:hAnsi="Lato"/>
           <w:b w:val="0"/>
           <w:i w:val="0"/>
           <w:sz w:val="22"/>
@@ -7279,7 +7407,7 @@
       </w:pPr>
       <w:r>
         <w:rPr>
-          <w:rFonts w:ascii="Inter" w:hAnsi="Inter"/>
+          <w:rFonts w:ascii="Lato" w:hAnsi="Lato"/>
           <w:b/>
           <w:color w:val="1E3A5F"/>
           <w:sz w:val="26"/>
@@ -7293,7 +7421,7 @@
       </w:pPr>
       <w:r>
         <w:rPr>
-          <w:rFonts w:ascii="Inter" w:hAnsi="Inter"/>
+          <w:rFonts w:ascii="Lato" w:hAnsi="Lato"/>
           <w:b w:val="0"/>
           <w:i w:val="0"/>
           <w:sz w:val="22"/>
@@ -7308,7 +7436,7 @@
       </w:pPr>
       <w:r>
         <w:rPr>
-          <w:rFonts w:ascii="Inter" w:hAnsi="Inter"/>
+          <w:rFonts w:ascii="Lato" w:hAnsi="Lato"/>
           <w:b/>
           <w:color w:val="1E3A5F"/>
           <w:sz w:val="26"/>
@@ -7322,7 +7450,7 @@
       </w:pPr>
       <w:r>
         <w:rPr>
-          <w:rFonts w:ascii="Inter" w:hAnsi="Inter"/>
+          <w:rFonts w:ascii="Lato" w:hAnsi="Lato"/>
           <w:b w:val="0"/>
           <w:i w:val="0"/>
           <w:sz w:val="22"/>
@@ -7337,7 +7465,7 @@
       </w:pPr>
       <w:r>
         <w:rPr>
-          <w:rFonts w:ascii="Inter" w:hAnsi="Inter"/>
+          <w:rFonts w:ascii="Lato" w:hAnsi="Lato"/>
           <w:b/>
           <w:color w:val="1E3A5F"/>
           <w:sz w:val="26"/>
@@ -7351,7 +7479,7 @@
       </w:pPr>
       <w:r>
         <w:rPr>
-          <w:rFonts w:ascii="Inter" w:hAnsi="Inter"/>
+          <w:rFonts w:ascii="Lato" w:hAnsi="Lato"/>
           <w:b w:val="0"/>
           <w:i w:val="0"/>
           <w:sz w:val="22"/>
@@ -7366,7 +7494,7 @@
       </w:pPr>
       <w:r>
         <w:rPr>
-          <w:rFonts w:ascii="Inter" w:hAnsi="Inter"/>
+          <w:rFonts w:ascii="Lato" w:hAnsi="Lato"/>
           <w:b/>
           <w:color w:val="1E3A5F"/>
           <w:sz w:val="26"/>
@@ -7380,7 +7508,7 @@
       </w:pPr>
       <w:r>
         <w:rPr>
-          <w:rFonts w:ascii="Inter" w:hAnsi="Inter"/>
+          <w:rFonts w:ascii="Lato" w:hAnsi="Lato"/>
           <w:b w:val="0"/>
           <w:i w:val="0"/>
           <w:sz w:val="22"/>
@@ -7395,7 +7523,7 @@
       </w:pPr>
       <w:r>
         <w:rPr>
-          <w:rFonts w:ascii="Inter" w:hAnsi="Inter"/>
+          <w:rFonts w:ascii="Lato" w:hAnsi="Lato"/>
           <w:b/>
           <w:color w:val="1E3A5F"/>
           <w:sz w:val="26"/>
@@ -7410,7 +7538,7 @@
       </w:pPr>
       <w:r>
         <w:rPr>
-          <w:rFonts w:ascii="Inter" w:hAnsi="Inter"/>
+          <w:rFonts w:ascii="Lato" w:hAnsi="Lato"/>
           <w:b w:val="0"/>
           <w:i/>
           <w:color w:val="374151"/>
@@ -7423,7 +7551,7 @@
       </w:r>
       <w:r>
         <w:rPr>
-          <w:rFonts w:ascii="Inter" w:hAnsi="Inter"/>
+          <w:rFonts w:ascii="Lato" w:hAnsi="Lato"/>
           <w:b w:val="0"/>
           <w:i w:val="0"/>
           <w:color w:val="6B7280"/>
@@ -7439,7 +7567,7 @@
       </w:pPr>
       <w:r>
         <w:rPr>
-          <w:rFonts w:ascii="Inter" w:hAnsi="Inter"/>
+          <w:rFonts w:ascii="Lato" w:hAnsi="Lato"/>
           <w:b w:val="0"/>
           <w:i/>
           <w:color w:val="374151"/>
@@ -7452,7 +7580,7 @@
       </w:r>
       <w:r>
         <w:rPr>
-          <w:rFonts w:ascii="Inter" w:hAnsi="Inter"/>
+          <w:rFonts w:ascii="Lato" w:hAnsi="Lato"/>
           <w:b w:val="0"/>
           <w:i w:val="0"/>
           <w:color w:val="6B7280"/>
@@ -7468,7 +7596,7 @@
       </w:pPr>
       <w:r>
         <w:rPr>
-          <w:rFonts w:ascii="Inter" w:hAnsi="Inter"/>
+          <w:rFonts w:ascii="Lato" w:hAnsi="Lato"/>
           <w:b w:val="0"/>
           <w:i/>
           <w:color w:val="374151"/>
@@ -7478,7 +7606,7 @@
       </w:r>
       <w:r>
         <w:rPr>
-          <w:rFonts w:ascii="Inter" w:hAnsi="Inter"/>
+          <w:rFonts w:ascii="Lato" w:hAnsi="Lato"/>
           <w:b w:val="0"/>
           <w:i w:val="0"/>
           <w:color w:val="6B7280"/>
@@ -7502,7 +7630,7 @@
       </w:pPr>
       <w:r>
         <w:rPr>
-          <w:rFonts w:ascii="Inter" w:hAnsi="Inter"/>
+          <w:rFonts w:ascii="Lato" w:hAnsi="Lato"/>
           <w:b/>
           <w:color w:val="1E3A5F"/>
           <w:sz w:val="32"/>
@@ -7516,7 +7644,7 @@
       </w:pPr>
       <w:r>
         <w:rPr>
-          <w:rFonts w:ascii="Inter" w:hAnsi="Inter"/>
+          <w:rFonts w:ascii="Lato" w:hAnsi="Lato"/>
           <w:b w:val="0"/>
           <w:i w:val="0"/>
           <w:color w:val="6B7280"/>
@@ -7526,7 +7654,7 @@
       </w:r>
       <w:r>
         <w:rPr>
-          <w:rFonts w:ascii="Inter" w:hAnsi="Inter"/>
+          <w:rFonts w:ascii="Lato" w:hAnsi="Lato"/>
           <w:b w:val="0"/>
           <w:i w:val="0"/>
           <w:color w:val="374151"/>
@@ -7536,7 +7664,7 @@
       </w:r>
       <w:r>
         <w:rPr>
-          <w:rFonts w:ascii="Inter" w:hAnsi="Inter"/>
+          <w:rFonts w:ascii="Lato" w:hAnsi="Lato"/>
           <w:b/>
           <w:i w:val="0"/>
           <w:color w:val="D97706"/>
@@ -7546,7 +7674,7 @@
       </w:r>
       <w:r>
         <w:rPr>
-          <w:rFonts w:ascii="Inter" w:hAnsi="Inter"/>
+          <w:rFonts w:ascii="Lato" w:hAnsi="Lato"/>
           <w:b w:val="0"/>
           <w:i w:val="0"/>
           <w:color w:val="374151"/>
@@ -7556,7 +7684,7 @@
       </w:r>
       <w:r>
         <w:rPr>
-          <w:rFonts w:ascii="Inter" w:hAnsi="Inter"/>
+          <w:rFonts w:ascii="Lato" w:hAnsi="Lato"/>
           <w:b/>
           <w:i w:val="0"/>
           <w:color w:val="374151"/>
@@ -7566,7 +7694,7 @@
       </w:r>
       <w:r>
         <w:rPr>
-          <w:rFonts w:ascii="Inter" w:hAnsi="Inter"/>
+          <w:rFonts w:ascii="Lato" w:hAnsi="Lato"/>
           <w:b w:val="0"/>
           <w:i w:val="0"/>
           <w:color w:val="6B7280"/>
@@ -7576,7 +7704,7 @@
       </w:r>
       <w:r>
         <w:rPr>
-          <w:rFonts w:ascii="Inter" w:hAnsi="Inter"/>
+          <w:rFonts w:ascii="Lato" w:hAnsi="Lato"/>
           <w:b w:val="0"/>
           <w:i w:val="0"/>
           <w:color w:val="6B7280"/>
@@ -7586,7 +7714,7 @@
       </w:r>
       <w:r>
         <w:rPr>
-          <w:rFonts w:ascii="Inter" w:hAnsi="Inter"/>
+          <w:rFonts w:ascii="Lato" w:hAnsi="Lato"/>
           <w:b/>
           <w:i w:val="0"/>
           <w:color w:val="059669"/>
@@ -7602,8 +7730,8 @@
       <w:r>
         <w:drawing>
           <wp:inline xmlns:a="http://schemas.openxmlformats.org/drawingml/2006/main" xmlns:pic="http://schemas.openxmlformats.org/drawingml/2006/picture">
-            <wp:extent cx="3474720" cy="3525078"/>
-            <wp:docPr id="17" name="Picture 17"/>
+            <wp:extent cx="3474720" cy="3547185"/>
+            <wp:docPr id="18" name="Picture 18"/>
             <wp:cNvGraphicFramePr>
               <a:graphicFrameLocks noChangeAspect="1"/>
             </wp:cNvGraphicFramePr>
@@ -7615,7 +7743,7 @@
                     <pic:cNvPicPr/>
                   </pic:nvPicPr>
                   <pic:blipFill>
-                    <a:blip r:embed="rId25"/>
+                    <a:blip r:embed="rId26"/>
                     <a:stretch>
                       <a:fillRect/>
                     </a:stretch>
@@ -7623,7 +7751,7 @@
                   <pic:spPr>
                     <a:xfrm>
                       <a:off x="0" y="0"/>
-                      <a:ext cx="3474720" cy="3525078"/>
+                      <a:ext cx="3474720" cy="3547185"/>
                     </a:xfrm>
                     <a:prstGeom prst="rect"/>
                   </pic:spPr>
@@ -7641,7 +7769,7 @@
       </w:pPr>
       <w:r>
         <w:rPr>
-          <w:rFonts w:ascii="Inter" w:hAnsi="Inter"/>
+          <w:rFonts w:ascii="Lato" w:hAnsi="Lato"/>
           <w:b w:val="0"/>
           <w:i/>
           <w:color w:val="6B7280"/>
@@ -7657,7 +7785,7 @@
       </w:pPr>
       <w:r>
         <w:rPr>
-          <w:rFonts w:ascii="Inter" w:hAnsi="Inter"/>
+          <w:rFonts w:ascii="Lato" w:hAnsi="Lato"/>
           <w:b/>
           <w:color w:val="1E3A5F"/>
           <w:sz w:val="26"/>
@@ -7671,7 +7799,7 @@
       </w:pPr>
       <w:r>
         <w:rPr>
-          <w:rFonts w:ascii="Inter" w:hAnsi="Inter"/>
+          <w:rFonts w:ascii="Lato" w:hAnsi="Lato"/>
           <w:b w:val="0"/>
           <w:i w:val="0"/>
           <w:sz w:val="22"/>
@@ -7686,7 +7814,7 @@
       </w:pPr>
       <w:r>
         <w:rPr>
-          <w:rFonts w:ascii="Inter" w:hAnsi="Inter"/>
+          <w:rFonts w:ascii="Lato" w:hAnsi="Lato"/>
           <w:b/>
           <w:color w:val="1E3A5F"/>
           <w:sz w:val="26"/>
@@ -7700,7 +7828,7 @@
       </w:pPr>
       <w:r>
         <w:rPr>
-          <w:rFonts w:ascii="Inter" w:hAnsi="Inter"/>
+          <w:rFonts w:ascii="Lato" w:hAnsi="Lato"/>
           <w:b w:val="0"/>
           <w:i w:val="0"/>
           <w:sz w:val="22"/>
@@ -7715,7 +7843,7 @@
       </w:pPr>
       <w:r>
         <w:rPr>
-          <w:rFonts w:ascii="Inter" w:hAnsi="Inter"/>
+          <w:rFonts w:ascii="Lato" w:hAnsi="Lato"/>
           <w:b/>
           <w:color w:val="1E3A5F"/>
           <w:sz w:val="26"/>
@@ -7729,7 +7857,7 @@
       </w:pPr>
       <w:r>
         <w:rPr>
-          <w:rFonts w:ascii="Inter" w:hAnsi="Inter"/>
+          <w:rFonts w:ascii="Lato" w:hAnsi="Lato"/>
           <w:b w:val="0"/>
           <w:i w:val="0"/>
           <w:sz w:val="22"/>
@@ -7744,7 +7872,7 @@
       </w:pPr>
       <w:r>
         <w:rPr>
-          <w:rFonts w:ascii="Inter" w:hAnsi="Inter"/>
+          <w:rFonts w:ascii="Lato" w:hAnsi="Lato"/>
           <w:b/>
           <w:color w:val="1E3A5F"/>
           <w:sz w:val="26"/>
@@ -7758,7 +7886,7 @@
       </w:pPr>
       <w:r>
         <w:rPr>
-          <w:rFonts w:ascii="Inter" w:hAnsi="Inter"/>
+          <w:rFonts w:ascii="Lato" w:hAnsi="Lato"/>
           <w:b w:val="0"/>
           <w:i w:val="0"/>
           <w:sz w:val="22"/>
@@ -7773,7 +7901,7 @@
       </w:pPr>
       <w:r>
         <w:rPr>
-          <w:rFonts w:ascii="Inter" w:hAnsi="Inter"/>
+          <w:rFonts w:ascii="Lato" w:hAnsi="Lato"/>
           <w:b/>
           <w:color w:val="1E3A5F"/>
           <w:sz w:val="26"/>
@@ -7787,7 +7915,7 @@
       </w:pPr>
       <w:r>
         <w:rPr>
-          <w:rFonts w:ascii="Inter" w:hAnsi="Inter"/>
+          <w:rFonts w:ascii="Lato" w:hAnsi="Lato"/>
           <w:b w:val="0"/>
           <w:i w:val="0"/>
           <w:sz w:val="22"/>
@@ -7802,7 +7930,7 @@
       </w:pPr>
       <w:r>
         <w:rPr>
-          <w:rFonts w:ascii="Inter" w:hAnsi="Inter"/>
+          <w:rFonts w:ascii="Lato" w:hAnsi="Lato"/>
           <w:b/>
           <w:color w:val="1E3A5F"/>
           <w:sz w:val="26"/>
@@ -7817,7 +7945,7 @@
       </w:pPr>
       <w:r>
         <w:rPr>
-          <w:rFonts w:ascii="Inter" w:hAnsi="Inter"/>
+          <w:rFonts w:ascii="Lato" w:hAnsi="Lato"/>
           <w:b w:val="0"/>
           <w:i/>
           <w:color w:val="374151"/>
@@ -7827,7 +7955,7 @@
       </w:r>
       <w:r>
         <w:rPr>
-          <w:rFonts w:ascii="Inter" w:hAnsi="Inter"/>
+          <w:rFonts w:ascii="Lato" w:hAnsi="Lato"/>
           <w:b w:val="0"/>
           <w:i w:val="0"/>
           <w:color w:val="6B7280"/>
@@ -7843,7 +7971,7 @@
       </w:pPr>
       <w:r>
         <w:rPr>
-          <w:rFonts w:ascii="Inter" w:hAnsi="Inter"/>
+          <w:rFonts w:ascii="Lato" w:hAnsi="Lato"/>
           <w:b w:val="0"/>
           <w:i/>
           <w:color w:val="374151"/>
@@ -7853,7 +7981,7 @@
       </w:r>
       <w:r>
         <w:rPr>
-          <w:rFonts w:ascii="Inter" w:hAnsi="Inter"/>
+          <w:rFonts w:ascii="Lato" w:hAnsi="Lato"/>
           <w:b w:val="0"/>
           <w:i w:val="0"/>
           <w:color w:val="6B7280"/>
@@ -7869,7 +7997,7 @@
       </w:pPr>
       <w:r>
         <w:rPr>
-          <w:rFonts w:ascii="Inter" w:hAnsi="Inter"/>
+          <w:rFonts w:ascii="Lato" w:hAnsi="Lato"/>
           <w:b w:val="0"/>
           <w:i/>
           <w:color w:val="374151"/>
@@ -7879,7 +8007,7 @@
       </w:r>
       <w:r>
         <w:rPr>
-          <w:rFonts w:ascii="Inter" w:hAnsi="Inter"/>
+          <w:rFonts w:ascii="Lato" w:hAnsi="Lato"/>
           <w:b w:val="0"/>
           <w:i w:val="0"/>
           <w:color w:val="6B7280"/>
@@ -7900,7 +8028,7 @@
       </w:pPr>
       <w:r>
         <w:rPr>
-          <w:rFonts w:ascii="Inter" w:hAnsi="Inter"/>
+          <w:rFonts w:ascii="Lato" w:hAnsi="Lato"/>
           <w:b/>
           <w:color w:val="1E3A5F"/>
           <w:sz w:val="44"/>
@@ -7914,7 +8042,7 @@
       </w:pPr>
       <w:r>
         <w:rPr>
-          <w:rFonts w:ascii="Inter" w:hAnsi="Inter"/>
+          <w:rFonts w:ascii="Lato" w:hAnsi="Lato"/>
           <w:b/>
           <w:i w:val="0"/>
           <w:color w:val="1E3A5F"/>
@@ -7924,7 +8052,7 @@
       </w:r>
       <w:r>
         <w:rPr>
-          <w:rFonts w:ascii="Inter" w:hAnsi="Inter"/>
+          <w:rFonts w:ascii="Lato" w:hAnsi="Lato"/>
           <w:b/>
           <w:i w:val="0"/>
           <w:color w:val="DC2626"/>
@@ -7939,7 +8067,7 @@
       </w:pPr>
       <w:r>
         <w:rPr>
-          <w:rFonts w:ascii="Inter" w:hAnsi="Inter"/>
+          <w:rFonts w:ascii="Lato" w:hAnsi="Lato"/>
           <w:b w:val="0"/>
           <w:i w:val="0"/>
           <w:sz w:val="22"/>
@@ -7971,7 +8099,7 @@
             <w:r/>
             <w:r>
               <w:rPr>
-                <w:rFonts w:ascii="Inter" w:hAnsi="Inter"/>
+                <w:rFonts w:ascii="Lato" w:hAnsi="Lato"/>
                 <w:b/>
                 <w:i w:val="0"/>
                 <w:color w:val="FFFFFF"/>
@@ -7993,7 +8121,7 @@
             <w:r/>
             <w:r>
               <w:rPr>
-                <w:rFonts w:ascii="Inter" w:hAnsi="Inter"/>
+                <w:rFonts w:ascii="Lato" w:hAnsi="Lato"/>
                 <w:b/>
                 <w:i w:val="0"/>
                 <w:color w:val="FFFFFF"/>
@@ -8015,7 +8143,7 @@
             <w:r/>
             <w:r>
               <w:rPr>
-                <w:rFonts w:ascii="Inter" w:hAnsi="Inter"/>
+                <w:rFonts w:ascii="Lato" w:hAnsi="Lato"/>
                 <w:b/>
                 <w:i w:val="0"/>
                 <w:color w:val="FFFFFF"/>
@@ -8044,7 +8172,7 @@
           <w:p>
             <w:r>
               <w:rPr>
-                <w:rFonts w:ascii="Inter" w:hAnsi="Inter"/>
+                <w:rFonts w:ascii="Lato" w:hAnsi="Lato"/>
                 <w:b/>
                 <w:i w:val="0"/>
                 <w:color w:val="DC2626"/>
@@ -8083,7 +8211,7 @@
           <w:p>
             <w:r>
               <w:rPr>
-                <w:rFonts w:ascii="Inter" w:hAnsi="Inter"/>
+                <w:rFonts w:ascii="Lato" w:hAnsi="Lato"/>
                 <w:b/>
                 <w:i w:val="0"/>
                 <w:color w:val="DC2626"/>
@@ -8122,7 +8250,7 @@
           <w:p>
             <w:r>
               <w:rPr>
-                <w:rFonts w:ascii="Inter" w:hAnsi="Inter"/>
+                <w:rFonts w:ascii="Lato" w:hAnsi="Lato"/>
                 <w:b/>
                 <w:i w:val="0"/>
                 <w:color w:val="DC2626"/>
@@ -8161,7 +8289,7 @@
           <w:p>
             <w:r>
               <w:rPr>
-                <w:rFonts w:ascii="Inter" w:hAnsi="Inter"/>
+                <w:rFonts w:ascii="Lato" w:hAnsi="Lato"/>
                 <w:b/>
                 <w:i w:val="0"/>
                 <w:color w:val="DC2626"/>
@@ -8200,7 +8328,7 @@
           <w:p>
             <w:r>
               <w:rPr>
-                <w:rFonts w:ascii="Inter" w:hAnsi="Inter"/>
+                <w:rFonts w:ascii="Lato" w:hAnsi="Lato"/>
                 <w:b/>
                 <w:i w:val="0"/>
                 <w:color w:val="DC2626"/>
@@ -8228,7 +8356,7 @@
       </w:pPr>
       <w:r>
         <w:rPr>
-          <w:rFonts w:ascii="Inter" w:hAnsi="Inter"/>
+          <w:rFonts w:ascii="Lato" w:hAnsi="Lato"/>
           <w:b/>
           <w:i w:val="0"/>
           <w:color w:val="1E3A5F"/>
@@ -8238,7 +8366,7 @@
       </w:r>
       <w:r>
         <w:rPr>
-          <w:rFonts w:ascii="Inter" w:hAnsi="Inter"/>
+          <w:rFonts w:ascii="Lato" w:hAnsi="Lato"/>
           <w:b w:val="0"/>
           <w:i w:val="0"/>
           <w:color w:val="374151"/>
@@ -8259,7 +8387,7 @@
       </w:pPr>
       <w:r>
         <w:rPr>
-          <w:rFonts w:ascii="Inter" w:hAnsi="Inter"/>
+          <w:rFonts w:ascii="Lato" w:hAnsi="Lato"/>
           <w:b/>
           <w:color w:val="1E3A5F"/>
           <w:sz w:val="44"/>
@@ -8274,7 +8402,7 @@
       </w:pPr>
       <w:r>
         <w:rPr>
-          <w:rFonts w:ascii="Inter" w:hAnsi="Inter"/>
+          <w:rFonts w:ascii="Lato" w:hAnsi="Lato"/>
           <w:b/>
           <w:color w:val="1E3A5F"/>
           <w:sz w:val="32"/>
@@ -8289,7 +8417,7 @@
       </w:pPr>
       <w:r>
         <w:rPr>
-          <w:rFonts w:ascii="Inter" w:hAnsi="Inter"/>
+          <w:rFonts w:ascii="Lato" w:hAnsi="Lato"/>
           <w:b/>
           <w:i w:val="0"/>
           <w:color w:val="1E3A5F"/>
@@ -8299,7 +8427,7 @@
       </w:r>
       <w:r>
         <w:rPr>
-          <w:rFonts w:ascii="Inter" w:hAnsi="Inter"/>
+          <w:rFonts w:ascii="Lato" w:hAnsi="Lato"/>
           <w:b w:val="0"/>
           <w:i w:val="0"/>
           <w:sz w:val="22"/>
@@ -8314,7 +8442,7 @@
       </w:pPr>
       <w:r>
         <w:rPr>
-          <w:rFonts w:ascii="Inter" w:hAnsi="Inter"/>
+          <w:rFonts w:ascii="Lato" w:hAnsi="Lato"/>
           <w:b/>
           <w:i w:val="0"/>
           <w:color w:val="1E3A5F"/>
@@ -8324,7 +8452,7 @@
       </w:r>
       <w:r>
         <w:rPr>
-          <w:rFonts w:ascii="Inter" w:hAnsi="Inter"/>
+          <w:rFonts w:ascii="Lato" w:hAnsi="Lato"/>
           <w:b w:val="0"/>
           <w:i w:val="0"/>
           <w:sz w:val="22"/>
@@ -8339,7 +8467,7 @@
       </w:pPr>
       <w:r>
         <w:rPr>
-          <w:rFonts w:ascii="Inter" w:hAnsi="Inter"/>
+          <w:rFonts w:ascii="Lato" w:hAnsi="Lato"/>
           <w:b/>
           <w:i w:val="0"/>
           <w:color w:val="1E3A5F"/>
@@ -8349,7 +8477,7 @@
       </w:r>
       <w:r>
         <w:rPr>
-          <w:rFonts w:ascii="Inter" w:hAnsi="Inter"/>
+          <w:rFonts w:ascii="Lato" w:hAnsi="Lato"/>
           <w:b w:val="0"/>
           <w:i w:val="0"/>
           <w:sz w:val="22"/>
@@ -8364,7 +8492,7 @@
       </w:pPr>
       <w:r>
         <w:rPr>
-          <w:rFonts w:ascii="Inter" w:hAnsi="Inter"/>
+          <w:rFonts w:ascii="Lato" w:hAnsi="Lato"/>
           <w:b/>
           <w:i w:val="0"/>
           <w:color w:val="1E3A5F"/>
@@ -8374,7 +8502,7 @@
       </w:r>
       <w:r>
         <w:rPr>
-          <w:rFonts w:ascii="Inter" w:hAnsi="Inter"/>
+          <w:rFonts w:ascii="Lato" w:hAnsi="Lato"/>
           <w:b w:val="0"/>
           <w:i w:val="0"/>
           <w:sz w:val="22"/>
@@ -8389,7 +8517,7 @@
       </w:pPr>
       <w:r>
         <w:rPr>
-          <w:rFonts w:ascii="Inter" w:hAnsi="Inter"/>
+          <w:rFonts w:ascii="Lato" w:hAnsi="Lato"/>
           <w:b/>
           <w:i w:val="0"/>
           <w:color w:val="1E3A5F"/>
@@ -8399,7 +8527,7 @@
       </w:r>
       <w:r>
         <w:rPr>
-          <w:rFonts w:ascii="Inter" w:hAnsi="Inter"/>
+          <w:rFonts w:ascii="Lato" w:hAnsi="Lato"/>
           <w:b w:val="0"/>
           <w:i w:val="0"/>
           <w:sz w:val="22"/>
@@ -8414,7 +8542,7 @@
       </w:pPr>
       <w:r>
         <w:rPr>
-          <w:rFonts w:ascii="Inter" w:hAnsi="Inter"/>
+          <w:rFonts w:ascii="Lato" w:hAnsi="Lato"/>
           <w:b/>
           <w:i w:val="0"/>
           <w:color w:val="1E3A5F"/>
@@ -8424,7 +8552,7 @@
       </w:r>
       <w:r>
         <w:rPr>
-          <w:rFonts w:ascii="Inter" w:hAnsi="Inter"/>
+          <w:rFonts w:ascii="Lato" w:hAnsi="Lato"/>
           <w:b w:val="0"/>
           <w:i w:val="0"/>
           <w:sz w:val="22"/>
@@ -8439,7 +8567,7 @@
       </w:pPr>
       <w:r>
         <w:rPr>
-          <w:rFonts w:ascii="Inter" w:hAnsi="Inter"/>
+          <w:rFonts w:ascii="Lato" w:hAnsi="Lato"/>
           <w:b/>
           <w:i w:val="0"/>
           <w:color w:val="1E3A5F"/>
@@ -8449,7 +8577,7 @@
       </w:r>
       <w:r>
         <w:rPr>
-          <w:rFonts w:ascii="Inter" w:hAnsi="Inter"/>
+          <w:rFonts w:ascii="Lato" w:hAnsi="Lato"/>
           <w:b w:val="0"/>
           <w:i w:val="0"/>
           <w:sz w:val="22"/>
@@ -8464,7 +8592,7 @@
       </w:pPr>
       <w:r>
         <w:rPr>
-          <w:rFonts w:ascii="Inter" w:hAnsi="Inter"/>
+          <w:rFonts w:ascii="Lato" w:hAnsi="Lato"/>
           <w:b/>
           <w:i w:val="0"/>
           <w:color w:val="1E3A5F"/>
@@ -8474,7 +8602,7 @@
       </w:r>
       <w:r>
         <w:rPr>
-          <w:rFonts w:ascii="Inter" w:hAnsi="Inter"/>
+          <w:rFonts w:ascii="Lato" w:hAnsi="Lato"/>
           <w:b w:val="0"/>
           <w:i w:val="0"/>
           <w:sz w:val="22"/>
@@ -8489,7 +8617,7 @@
       </w:pPr>
       <w:r>
         <w:rPr>
-          <w:rFonts w:ascii="Inter" w:hAnsi="Inter"/>
+          <w:rFonts w:ascii="Lato" w:hAnsi="Lato"/>
           <w:b/>
           <w:color w:val="1E3A5F"/>
           <w:sz w:val="32"/>
@@ -8504,7 +8632,7 @@
       </w:pPr>
       <w:r>
         <w:rPr>
-          <w:rFonts w:ascii="Inter" w:hAnsi="Inter"/>
+          <w:rFonts w:ascii="Lato" w:hAnsi="Lato"/>
           <w:b/>
           <w:color w:val="1E3A5F"/>
           <w:sz w:val="26"/>
@@ -8518,7 +8646,7 @@
       </w:pPr>
       <w:r>
         <w:rPr>
-          <w:rFonts w:ascii="Inter" w:hAnsi="Inter"/>
+          <w:rFonts w:ascii="Lato" w:hAnsi="Lato"/>
           <w:b w:val="0"/>
           <w:i w:val="0"/>
           <w:sz w:val="22"/>
@@ -8533,7 +8661,7 @@
       </w:pPr>
       <w:r>
         <w:rPr>
-          <w:rFonts w:ascii="Inter" w:hAnsi="Inter"/>
+          <w:rFonts w:ascii="Lato" w:hAnsi="Lato"/>
           <w:b/>
           <w:color w:val="1E3A5F"/>
           <w:sz w:val="26"/>
@@ -8547,7 +8675,7 @@
       </w:pPr>
       <w:r>
         <w:rPr>
-          <w:rFonts w:ascii="Inter" w:hAnsi="Inter"/>
+          <w:rFonts w:ascii="Lato" w:hAnsi="Lato"/>
           <w:b w:val="0"/>
           <w:i w:val="0"/>
           <w:sz w:val="22"/>
@@ -8562,7 +8690,7 @@
       </w:pPr>
       <w:r>
         <w:rPr>
-          <w:rFonts w:ascii="Inter" w:hAnsi="Inter"/>
+          <w:rFonts w:ascii="Lato" w:hAnsi="Lato"/>
           <w:b/>
           <w:color w:val="1E3A5F"/>
           <w:sz w:val="26"/>
@@ -8576,7 +8704,7 @@
       </w:pPr>
       <w:r>
         <w:rPr>
-          <w:rFonts w:ascii="Inter" w:hAnsi="Inter"/>
+          <w:rFonts w:ascii="Lato" w:hAnsi="Lato"/>
           <w:b w:val="0"/>
           <w:i w:val="0"/>
           <w:sz w:val="22"/>
@@ -8591,7 +8719,7 @@
       </w:pPr>
       <w:r>
         <w:rPr>
-          <w:rFonts w:ascii="Inter" w:hAnsi="Inter"/>
+          <w:rFonts w:ascii="Lato" w:hAnsi="Lato"/>
           <w:b/>
           <w:color w:val="1E3A5F"/>
           <w:sz w:val="32"/>
@@ -8606,7 +8734,7 @@
       </w:pPr>
       <w:r>
         <w:rPr>
-          <w:rFonts w:ascii="Inter" w:hAnsi="Inter"/>
+          <w:rFonts w:ascii="Lato" w:hAnsi="Lato"/>
           <w:b w:val="0"/>
           <w:i w:val="0"/>
           <w:sz w:val="22"/>
@@ -8621,7 +8749,7 @@
       </w:pPr>
       <w:r>
         <w:rPr>
-          <w:rFonts w:ascii="Inter" w:hAnsi="Inter"/>
+          <w:rFonts w:ascii="Lato" w:hAnsi="Lato"/>
           <w:b w:val="0"/>
           <w:i w:val="0"/>
           <w:sz w:val="22"/>
@@ -8636,7 +8764,7 @@
       </w:pPr>
       <w:r>
         <w:rPr>
-          <w:rFonts w:ascii="Inter" w:hAnsi="Inter"/>
+          <w:rFonts w:ascii="Lato" w:hAnsi="Lato"/>
           <w:b w:val="0"/>
           <w:i w:val="0"/>
           <w:sz w:val="22"/>
@@ -8651,7 +8779,7 @@
       </w:pPr>
       <w:r>
         <w:rPr>
-          <w:rFonts w:ascii="Inter" w:hAnsi="Inter"/>
+          <w:rFonts w:ascii="Lato" w:hAnsi="Lato"/>
           <w:b w:val="0"/>
           <w:i w:val="0"/>
           <w:sz w:val="22"/>
@@ -8666,7 +8794,7 @@
       </w:pPr>
       <w:r>
         <w:rPr>
-          <w:rFonts w:ascii="Inter" w:hAnsi="Inter"/>
+          <w:rFonts w:ascii="Lato" w:hAnsi="Lato"/>
           <w:b w:val="0"/>
           <w:i w:val="0"/>
           <w:sz w:val="22"/>
@@ -8686,7 +8814,7 @@
       </w:pPr>
       <w:r>
         <w:rPr>
-          <w:rFonts w:ascii="Inter" w:hAnsi="Inter"/>
+          <w:rFonts w:ascii="Lato" w:hAnsi="Lato"/>
           <w:b/>
           <w:color w:val="1E3A5F"/>
           <w:sz w:val="44"/>
@@ -8700,7 +8828,7 @@
       </w:pPr>
       <w:r>
         <w:rPr>
-          <w:rFonts w:ascii="Inter" w:hAnsi="Inter"/>
+          <w:rFonts w:ascii="Lato" w:hAnsi="Lato"/>
           <w:b w:val="0"/>
           <w:i w:val="0"/>
           <w:sz w:val="22"/>
@@ -8733,7 +8861,7 @@
             <w:r/>
             <w:r>
               <w:rPr>
-                <w:rFonts w:ascii="Inter" w:hAnsi="Inter"/>
+                <w:rFonts w:ascii="Lato" w:hAnsi="Lato"/>
                 <w:b/>
                 <w:i w:val="0"/>
                 <w:color w:val="FFFFFF"/>
@@ -8755,7 +8883,7 @@
             <w:r/>
             <w:r>
               <w:rPr>
-                <w:rFonts w:ascii="Inter" w:hAnsi="Inter"/>
+                <w:rFonts w:ascii="Lato" w:hAnsi="Lato"/>
                 <w:b/>
                 <w:i w:val="0"/>
                 <w:color w:val="FFFFFF"/>
@@ -8777,7 +8905,7 @@
             <w:r/>
             <w:r>
               <w:rPr>
-                <w:rFonts w:ascii="Inter" w:hAnsi="Inter"/>
+                <w:rFonts w:ascii="Lato" w:hAnsi="Lato"/>
                 <w:b/>
                 <w:i w:val="0"/>
                 <w:color w:val="FFFFFF"/>
@@ -8799,7 +8927,7 @@
             <w:r/>
             <w:r>
               <w:rPr>
-                <w:rFonts w:ascii="Inter" w:hAnsi="Inter"/>
+                <w:rFonts w:ascii="Lato" w:hAnsi="Lato"/>
                 <w:b/>
                 <w:i w:val="0"/>
                 <w:color w:val="FFFFFF"/>
@@ -8985,7 +9113,7 @@
       </w:pPr>
       <w:r>
         <w:rPr>
-          <w:rFonts w:ascii="Inter" w:hAnsi="Inter"/>
+          <w:rFonts w:ascii="Lato" w:hAnsi="Lato"/>
           <w:b w:val="0"/>
           <w:i w:val="0"/>
           <w:sz w:val="22"/>
@@ -9000,7 +9128,7 @@
       </w:pPr>
       <w:r>
         <w:rPr>
-          <w:rFonts w:ascii="Inter" w:hAnsi="Inter"/>
+          <w:rFonts w:ascii="Lato" w:hAnsi="Lato"/>
           <w:b/>
           <w:color w:val="1E3A5F"/>
           <w:sz w:val="32"/>
@@ -9014,7 +9142,7 @@
       </w:pPr>
       <w:r>
         <w:rPr>
-          <w:rFonts w:ascii="Inter" w:hAnsi="Inter"/>
+          <w:rFonts w:ascii="Lato" w:hAnsi="Lato"/>
           <w:b w:val="0"/>
           <w:i w:val="0"/>
           <w:sz w:val="22"/>
@@ -9029,7 +9157,7 @@
       </w:pPr>
       <w:r>
         <w:rPr>
-          <w:rFonts w:ascii="Inter" w:hAnsi="Inter"/>
+          <w:rFonts w:ascii="Lato" w:hAnsi="Lato"/>
           <w:b/>
           <w:color w:val="1E3A5F"/>
           <w:sz w:val="32"/>
@@ -9043,7 +9171,7 @@
       </w:pPr>
       <w:r>
         <w:rPr>
-          <w:rFonts w:ascii="Inter" w:hAnsi="Inter"/>
+          <w:rFonts w:ascii="Lato" w:hAnsi="Lato"/>
           <w:b w:val="0"/>
           <w:i w:val="0"/>
           <w:sz w:val="22"/>
@@ -9058,7 +9186,7 @@
       </w:pPr>
       <w:r>
         <w:rPr>
-          <w:rFonts w:ascii="Inter" w:hAnsi="Inter"/>
+          <w:rFonts w:ascii="Lato" w:hAnsi="Lato"/>
           <w:b/>
           <w:color w:val="1E3A5F"/>
           <w:sz w:val="32"/>
@@ -9072,7 +9200,7 @@
       </w:pPr>
       <w:r>
         <w:rPr>
-          <w:rFonts w:ascii="Inter" w:hAnsi="Inter"/>
+          <w:rFonts w:ascii="Lato" w:hAnsi="Lato"/>
           <w:b w:val="0"/>
           <w:i w:val="0"/>
           <w:sz w:val="22"/>

</xml_diff>